<commit_message>
Update concept note: Vendors Hub, CAC through Wema, invoices, sealed records, evidence file, live MVP
Co-Authored-By: Claude Opus 5.5 <noreply@anthropic.com>
Claude-Session: https://claude.ai/code/session_01RWS1ehYaye8ci8hcvFBjhP
</commit_message>
<xml_diff>
--- a/docs/Vendora_Concept_Note_Wema_Hackaholics_7.docx
+++ b/docs/Vendora_Concept_Note_Wema_Hackaholics_7.docx
@@ -413,7 +413,7 @@
                 <w:sz w:val="20"/>
                 <w:szCs w:val="20"/>
               </w:rPr>
-              <w:t xml:space="preserve">October 11, 2026</w:t>
+              <w:t xml:space="preserve">October 12, 2026 (updated)</w:t>
             </w:r>
           </w:p>
         </w:tc>
@@ -447,6 +447,68 @@
                 <w:sz w:val="20"/>
                 <w:szCs w:val="20"/>
               </w:rPr>
+              <w:t xml:space="preserve">Working MVP</w:t>
+            </w:r>
+          </w:p>
+        </w:tc>
+        <w:tc>
+          <w:tcPr>
+            <w:tcW w:type="dxa" w:w="6426"/>
+            <w:tcBorders>
+              <w:top w:val="single" w:color="C9D3E6" w:sz="4"/>
+              <w:left w:val="single" w:color="C9D3E6" w:sz="4"/>
+              <w:bottom w:val="single" w:color="C9D3E6" w:sz="4"/>
+              <w:right w:val="single" w:color="C9D3E6" w:sz="4"/>
+            </w:tcBorders>
+            <w:shd w:fill="FFFFFF" w:color="auto" w:val="clear"/>
+            <w:tcMar>
+              <w:top w:type="dxa" w:w="80"/>
+              <w:left w:type="dxa" w:w="110"/>
+              <w:bottom w:type="dxa" w:w="80"/>
+              <w:right w:type="dxa" w:w="110"/>
+            </w:tcMar>
+          </w:tcPr>
+          <w:p>
+            <w:r>
+              <w:rPr>
+                <w:rFonts w:ascii="Arial" w:cs="Arial" w:eastAsia="Arial" w:hAnsi="Arial"/>
+                <w:sz w:val="20"/>
+                <w:szCs w:val="20"/>
+              </w:rPr>
+              <w:t xml:space="preserve">https://devemmy.github.io/VENDORA/ (open in Chrome; tap "Explore a sample shop")</w:t>
+            </w:r>
+          </w:p>
+        </w:tc>
+      </w:tr>
+      <w:tr>
+        <w:trPr>
+          <w:cantSplit/>
+          <w:tblHeader w:val="false"/>
+        </w:trPr>
+        <w:tc>
+          <w:tcPr>
+            <w:tcW w:type="dxa" w:w="2600"/>
+            <w:tcBorders>
+              <w:top w:val="single" w:color="C9D3E6" w:sz="4"/>
+              <w:left w:val="single" w:color="C9D3E6" w:sz="4"/>
+              <w:bottom w:val="single" w:color="C9D3E6" w:sz="4"/>
+              <w:right w:val="single" w:color="C9D3E6" w:sz="4"/>
+            </w:tcBorders>
+            <w:shd w:fill="F6F8FC" w:color="auto" w:val="clear"/>
+            <w:tcMar>
+              <w:top w:type="dxa" w:w="80"/>
+              <w:left w:type="dxa" w:w="110"/>
+              <w:bottom w:type="dxa" w:w="80"/>
+              <w:right w:type="dxa" w:w="110"/>
+            </w:tcMar>
+          </w:tcPr>
+          <w:p>
+            <w:r>
+              <w:rPr>
+                <w:rFonts w:ascii="Arial" w:cs="Arial" w:eastAsia="Arial" w:hAnsi="Arial"/>
+                <w:sz w:val="20"/>
+                <w:szCs w:val="20"/>
+              </w:rPr>
               <w:t xml:space="preserve">Status</w:t>
             </w:r>
           </w:p>
@@ -460,7 +522,7 @@
               <w:bottom w:val="single" w:color="C9D3E6" w:sz="4"/>
               <w:right w:val="single" w:color="C9D3E6" w:sz="4"/>
             </w:tcBorders>
-            <w:shd w:fill="FFFFFF" w:color="auto" w:val="clear"/>
+            <w:shd w:fill="F6F8FC" w:color="auto" w:val="clear"/>
             <w:tcMar>
               <w:top w:type="dxa" w:w="80"/>
               <w:left w:type="dxa" w:w="110"/>
@@ -617,6 +679,91 @@
           <w:szCs w:val="22"/>
         </w:rPr>
         <w:t xml:space="preserve">, repaid in small daily amounts from sales.</w:t>
+      </w:r>
+    </w:p>
+    <w:p>
+      <w:pPr>
+        <w:spacing w:after="120" w:line="300"/>
+      </w:pPr>
+      <w:r>
+        <w:rPr>
+          <w:rFonts w:ascii="Arial" w:cs="Arial" w:eastAsia="Arial" w:hAnsi="Arial"/>
+          <w:sz w:val="22"/>
+          <w:szCs w:val="22"/>
+        </w:rPr>
+        <w:t xml:space="preserve">Around the assistant, Vendora gives traders what they need to grow: a </w:t>
+      </w:r>
+      <w:r>
+        <w:rPr>
+          <w:rFonts w:ascii="Arial" w:cs="Arial" w:eastAsia="Arial" w:hAnsi="Arial"/>
+          <w:b/>
+          <w:bCs/>
+          <w:sz w:val="22"/>
+          <w:szCs w:val="22"/>
+        </w:rPr>
+        <w:t xml:space="preserve">Vendors Hub</w:t>
+      </w:r>
+      <w:r>
+        <w:rPr>
+          <w:rFonts w:ascii="Arial" w:cs="Arial" w:eastAsia="Arial" w:hAnsi="Arial"/>
+          <w:sz w:val="22"/>
+          <w:szCs w:val="22"/>
+        </w:rPr>
+        <w:t xml:space="preserve"> of verified bulk sellers they can order from (with a Wema loan if needed), </w:t>
+      </w:r>
+      <w:r>
+        <w:rPr>
+          <w:rFonts w:ascii="Arial" w:cs="Arial" w:eastAsia="Arial" w:hAnsi="Arial"/>
+          <w:b/>
+          <w:bCs/>
+          <w:sz w:val="22"/>
+          <w:szCs w:val="22"/>
+        </w:rPr>
+        <w:t xml:space="preserve">numbered invoices</w:t>
+      </w:r>
+      <w:r>
+        <w:rPr>
+          <w:rFonts w:ascii="Arial" w:cs="Arial" w:eastAsia="Arial" w:hAnsi="Arial"/>
+          <w:sz w:val="22"/>
+          <w:szCs w:val="22"/>
+        </w:rPr>
+        <w:t xml:space="preserve"> for every sale, a way to </w:t>
+      </w:r>
+      <w:r>
+        <w:rPr>
+          <w:rFonts w:ascii="Arial" w:cs="Arial" w:eastAsia="Arial" w:hAnsi="Arial"/>
+          <w:b/>
+          <w:bCs/>
+          <w:sz w:val="22"/>
+          <w:szCs w:val="22"/>
+        </w:rPr>
+        <w:t xml:space="preserve">register their business with CAC through Wema</w:t>
+      </w:r>
+      <w:r>
+        <w:rPr>
+          <w:rFonts w:ascii="Arial" w:cs="Arial" w:eastAsia="Arial" w:hAnsi="Arial"/>
+          <w:sz w:val="22"/>
+          <w:szCs w:val="22"/>
+        </w:rPr>
+        <w:t xml:space="preserve"> by saving a small amount each day, and </w:t>
+      </w:r>
+      <w:r>
+        <w:rPr>
+          <w:rFonts w:ascii="Arial" w:cs="Arial" w:eastAsia="Arial" w:hAnsi="Arial"/>
+          <w:b/>
+          <w:bCs/>
+          <w:sz w:val="22"/>
+          <w:szCs w:val="22"/>
+        </w:rPr>
+        <w:t xml:space="preserve">sealed records</w:t>
+      </w:r>
+      <w:r>
+        <w:rPr>
+          <w:rFonts w:ascii="Arial" w:cs="Arial" w:eastAsia="Arial" w:hAnsi="Arial"/>
+          <w:sz w:val="22"/>
+          <w:szCs w:val="22"/>
+        </w:rPr>
+        <w:t xml:space="preserve"> that cannot be quietly changed, which Wema can check line by line in an Excel evidence file.</w:t>
       </w:r>
     </w:p>
     <w:tbl>
@@ -669,7 +816,81 @@
                 <w:sz w:val="22"/>
                 <w:szCs w:val="22"/>
               </w:rPr>
-              <w:t xml:space="preserve"> traders get an assistant that works in their language and protects their money. Wema gets new accounts, more deposits and payments, and safe small-business borrowers it can see clearly.</w:t>
+              <w:t xml:space="preserve"> traders get an assistant that works in their language and protects their money. Wema gets new accounts, more deposits and payments, and safe small-business borrowers whose records it can trust.</w:t>
+            </w:r>
+          </w:p>
+        </w:tc>
+      </w:tr>
+    </w:tbl>
+    <w:tbl>
+      <w:tblPr>
+        <w:tblW w:type="dxa" w:w="9026"/>
+        <w:tblBorders>
+          <w:top w:val="single" w:color="auto" w:sz="4"/>
+          <w:left w:val="single" w:color="auto" w:sz="4"/>
+          <w:bottom w:val="single" w:color="auto" w:sz="4"/>
+          <w:right w:val="single" w:color="auto" w:sz="4"/>
+          <w:insideH w:val="single" w:color="auto" w:sz="4"/>
+          <w:insideV w:val="single" w:color="auto" w:sz="4"/>
+        </w:tblBorders>
+      </w:tblPr>
+      <w:tblGrid>
+        <w:gridCol w:w="9026"/>
+      </w:tblGrid>
+      <w:tr>
+        <w:tc>
+          <w:tcPr>
+            <w:tcW w:type="dxa" w:w="9026"/>
+            <w:tcBorders>
+              <w:top w:val="none" w:color="FFFFFF" w:sz="0"/>
+              <w:left w:val="single" w:color="F5B800" w:sz="24"/>
+              <w:bottom w:val="none" w:color="FFFFFF" w:sz="0"/>
+              <w:right w:val="none" w:color="FFFFFF" w:sz="0"/>
+            </w:tcBorders>
+            <w:shd w:fill="FFF6D6" w:color="auto" w:val="clear"/>
+            <w:tcMar>
+              <w:top w:type="dxa" w:w="140"/>
+              <w:left w:type="dxa" w:w="200"/>
+              <w:bottom w:type="dxa" w:w="140"/>
+              <w:right w:type="dxa" w:w="200"/>
+            </w:tcMar>
+          </w:tcPr>
+          <w:p>
+            <w:r>
+              <w:rPr>
+                <w:rFonts w:ascii="Arial" w:cs="Arial" w:eastAsia="Arial" w:hAnsi="Arial"/>
+                <w:b/>
+                <w:bCs/>
+                <w:sz w:val="22"/>
+                <w:szCs w:val="22"/>
+              </w:rPr>
+              <w:t xml:space="preserve">We have a working MVP.</w:t>
+            </w:r>
+            <w:r>
+              <w:rPr>
+                <w:rFonts w:ascii="Arial" w:cs="Arial" w:eastAsia="Arial" w:hAnsi="Arial"/>
+                <w:sz w:val="22"/>
+                <w:szCs w:val="22"/>
+              </w:rPr>
+              <w:t xml:space="preserve"> The web app is live at </w:t>
+            </w:r>
+            <w:r>
+              <w:rPr>
+                <w:rFonts w:ascii="Arial" w:cs="Arial" w:eastAsia="Arial" w:hAnsi="Arial"/>
+                <w:b/>
+                <w:bCs/>
+                <w:sz w:val="22"/>
+                <w:szCs w:val="22"/>
+              </w:rPr>
+              <w:t xml:space="preserve">https://devemmy.github.io/VENDORA/</w:t>
+            </w:r>
+            <w:r>
+              <w:rPr>
+                <w:rFonts w:ascii="Arial" w:cs="Arial" w:eastAsia="Arial" w:hAnsi="Arial"/>
+                <w:sz w:val="22"/>
+                <w:szCs w:val="22"/>
+              </w:rPr>
+              <w:t xml:space="preserve"> and runs on phones, tablets and laptops, even offline. Judges can tap "Explore a sample shop" to see a trader with 30 days of real-looking history. Wema services are simulated until API access is granted.</w:t>
             </w:r>
           </w:p>
         </w:tc>
@@ -1450,6 +1671,62 @@
     </w:p>
     <w:p>
       <w:pPr>
+        <w:pStyle w:val="ListParagraph"/>
+        <w:numPr>
+          <w:ilvl w:val="0"/>
+          <w:numId w:val="3"/>
+        </w:numPr>
+        <w:spacing w:after="80" w:line="290"/>
+      </w:pPr>
+      <w:r>
+        <w:rPr>
+          <w:rFonts w:ascii="Arial" w:cs="Arial" w:eastAsia="Arial" w:hAnsi="Arial"/>
+          <w:b/>
+          <w:bCs/>
+          <w:sz w:val="22"/>
+          <w:szCs w:val="22"/>
+        </w:rPr>
+        <w:t xml:space="preserve">Any device:</w:t>
+      </w:r>
+      <w:r>
+        <w:rPr>
+          <w:rFonts w:ascii="Arial" w:cs="Arial" w:eastAsia="Arial" w:hAnsi="Arial"/>
+          <w:sz w:val="22"/>
+          <w:szCs w:val="22"/>
+        </w:rPr>
+        <w:t xml:space="preserve"> on a phone it is a simple app with a big gold Talk button; on a laptop it becomes a full website with a sidebar, so a shop owner can review the business from a desk.</w:t>
+      </w:r>
+    </w:p>
+    <w:p>
+      <w:pPr>
+        <w:pStyle w:val="ListParagraph"/>
+        <w:numPr>
+          <w:ilvl w:val="0"/>
+          <w:numId w:val="3"/>
+        </w:numPr>
+        <w:spacing w:after="80" w:line="290"/>
+      </w:pPr>
+      <w:r>
+        <w:rPr>
+          <w:rFonts w:ascii="Arial" w:cs="Arial" w:eastAsia="Arial" w:hAnsi="Arial"/>
+          <w:b/>
+          <w:bCs/>
+          <w:sz w:val="22"/>
+          <w:szCs w:val="22"/>
+        </w:rPr>
+        <w:t xml:space="preserve">No typing needed:</w:t>
+      </w:r>
+      <w:r>
+        <w:rPr>
+          <w:rFonts w:ascii="Arial" w:cs="Arial" w:eastAsia="Arial" w:hAnsi="Arial"/>
+          <w:sz w:val="22"/>
+          <w:szCs w:val="22"/>
+        </w:rPr>
+        <w:t xml:space="preserve"> besides voice, traders sell by tapping item tiles (like a till) and restock by tapping + on each item when goods arrive.</w:t>
+      </w:r>
+    </w:p>
+    <w:p>
+      <w:pPr>
         <w:pStyle w:val="Heading1"/>
         <w:pBdr>
           <w:bottom w:val="single" w:color="F5B800" w:sz="8" w:space="4"/>
@@ -1846,7 +2123,7 @@
                 <w:sz w:val="20"/>
                 <w:szCs w:val="20"/>
               </w:rPr>
-              <w:t xml:space="preserve">Customer debts list</w:t>
+              <w:t xml:space="preserve">Receipt check (scan or type)</w:t>
             </w:r>
           </w:p>
         </w:tc>
@@ -1874,7 +2151,7 @@
                 <w:sz w:val="20"/>
                 <w:szCs w:val="20"/>
               </w:rPr>
-              <w:t xml:space="preserve">"Baba Ayo paid ₦3,000, balance ₦2,000 on Friday" is recorded and tracked by voice.</w:t>
+              <w:t xml:space="preserve">When a customer says "I have paid", the trader scans the receipt or types the details. Vendora checks it with Wema. A receipt can only be used once, so the same screenshot cannot be shown twice.</w:t>
             </w:r>
           </w:p>
         </w:tc>
@@ -1908,7 +2185,7 @@
                 <w:sz w:val="20"/>
                 <w:szCs w:val="20"/>
               </w:rPr>
-              <w:t xml:space="preserve">Daily summary</w:t>
+              <w:t xml:space="preserve">Customer debts list</w:t>
             </w:r>
           </w:p>
         </w:tc>
@@ -1936,7 +2213,7 @@
                 <w:sz w:val="20"/>
                 <w:szCs w:val="20"/>
               </w:rPr>
-              <w:t xml:space="preserve">Sales, profit and best sellers, read out loud or sent on WhatsApp at the end of the day.</w:t>
+              <w:t xml:space="preserve">"Baba Ayo paid ₦3,000, balance ₦2,000 on Friday" is recorded and tracked by voice, with one-tap WhatsApp reminders.</w:t>
             </w:r>
           </w:p>
         </w:tc>
@@ -1970,6 +2247,192 @@
                 <w:sz w:val="20"/>
                 <w:szCs w:val="20"/>
               </w:rPr>
+              <w:t xml:space="preserve">Numbered invoices</w:t>
+            </w:r>
+          </w:p>
+        </w:tc>
+        <w:tc>
+          <w:tcPr>
+            <w:tcW w:type="dxa" w:w="6326"/>
+            <w:tcBorders>
+              <w:top w:val="single" w:color="C9D3E6" w:sz="4"/>
+              <w:left w:val="single" w:color="C9D3E6" w:sz="4"/>
+              <w:bottom w:val="single" w:color="C9D3E6" w:sz="4"/>
+              <w:right w:val="single" w:color="C9D3E6" w:sz="4"/>
+            </w:tcBorders>
+            <w:shd w:fill="FFFFFF" w:color="auto" w:val="clear"/>
+            <w:tcMar>
+              <w:top w:type="dxa" w:w="80"/>
+              <w:left w:type="dxa" w:w="110"/>
+              <w:bottom w:type="dxa" w:w="80"/>
+              <w:right w:type="dxa" w:w="110"/>
+            </w:tcMar>
+          </w:tcPr>
+          <w:p>
+            <w:r>
+              <w:rPr>
+                <w:rFonts w:ascii="Arial" w:cs="Arial" w:eastAsia="Arial" w:hAnsi="Arial"/>
+                <w:sz w:val="20"/>
+                <w:szCs w:val="20"/>
+              </w:rPr>
+              <w:t xml:space="preserve">Every sale gets an invoice (INV-00001) with items, payment proof and a record seal. Share on WhatsApp, print or save as PDF.</w:t>
+            </w:r>
+          </w:p>
+        </w:tc>
+      </w:tr>
+      <w:tr>
+        <w:trPr>
+          <w:cantSplit/>
+          <w:tblHeader w:val="false"/>
+        </w:trPr>
+        <w:tc>
+          <w:tcPr>
+            <w:tcW w:type="dxa" w:w="2700"/>
+            <w:tcBorders>
+              <w:top w:val="single" w:color="C9D3E6" w:sz="4"/>
+              <w:left w:val="single" w:color="C9D3E6" w:sz="4"/>
+              <w:bottom w:val="single" w:color="C9D3E6" w:sz="4"/>
+              <w:right w:val="single" w:color="C9D3E6" w:sz="4"/>
+            </w:tcBorders>
+            <w:shd w:fill="F6F8FC" w:color="auto" w:val="clear"/>
+            <w:tcMar>
+              <w:top w:type="dxa" w:w="80"/>
+              <w:left w:type="dxa" w:w="110"/>
+              <w:bottom w:type="dxa" w:w="80"/>
+              <w:right w:type="dxa" w:w="110"/>
+            </w:tcMar>
+          </w:tcPr>
+          <w:p>
+            <w:r>
+              <w:rPr>
+                <w:rFonts w:ascii="Arial" w:cs="Arial" w:eastAsia="Arial" w:hAnsi="Arial"/>
+                <w:sz w:val="20"/>
+                <w:szCs w:val="20"/>
+              </w:rPr>
+              <w:t xml:space="preserve">Precise shop location</w:t>
+            </w:r>
+          </w:p>
+        </w:tc>
+        <w:tc>
+          <w:tcPr>
+            <w:tcW w:type="dxa" w:w="6326"/>
+            <w:tcBorders>
+              <w:top w:val="single" w:color="C9D3E6" w:sz="4"/>
+              <w:left w:val="single" w:color="C9D3E6" w:sz="4"/>
+              <w:bottom w:val="single" w:color="C9D3E6" w:sz="4"/>
+              <w:right w:val="single" w:color="C9D3E6" w:sz="4"/>
+            </w:tcBorders>
+            <w:shd w:fill="F6F8FC" w:color="auto" w:val="clear"/>
+            <w:tcMar>
+              <w:top w:type="dxa" w:w="80"/>
+              <w:left w:type="dxa" w:w="110"/>
+              <w:bottom w:type="dxa" w:w="80"/>
+              <w:right w:type="dxa" w:w="110"/>
+            </w:tcMar>
+          </w:tcPr>
+          <w:p>
+            <w:r>
+              <w:rPr>
+                <w:rFonts w:ascii="Arial" w:cs="Arial" w:eastAsia="Arial" w:hAnsi="Arial"/>
+                <w:sz w:val="20"/>
+                <w:szCs w:val="20"/>
+              </w:rPr>
+              <w:t xml:space="preserve">One tap saves the shop's GPS position. It appears on the Vendors Hub, invoices and the evidence file Wema receives.</w:t>
+            </w:r>
+          </w:p>
+        </w:tc>
+      </w:tr>
+      <w:tr>
+        <w:trPr>
+          <w:cantSplit/>
+          <w:tblHeader w:val="false"/>
+        </w:trPr>
+        <w:tc>
+          <w:tcPr>
+            <w:tcW w:type="dxa" w:w="2700"/>
+            <w:tcBorders>
+              <w:top w:val="single" w:color="C9D3E6" w:sz="4"/>
+              <w:left w:val="single" w:color="C9D3E6" w:sz="4"/>
+              <w:bottom w:val="single" w:color="C9D3E6" w:sz="4"/>
+              <w:right w:val="single" w:color="C9D3E6" w:sz="4"/>
+            </w:tcBorders>
+            <w:shd w:fill="FFFFFF" w:color="auto" w:val="clear"/>
+            <w:tcMar>
+              <w:top w:type="dxa" w:w="80"/>
+              <w:left w:type="dxa" w:w="110"/>
+              <w:bottom w:type="dxa" w:w="80"/>
+              <w:right w:type="dxa" w:w="110"/>
+            </w:tcMar>
+          </w:tcPr>
+          <w:p>
+            <w:r>
+              <w:rPr>
+                <w:rFonts w:ascii="Arial" w:cs="Arial" w:eastAsia="Arial" w:hAnsi="Arial"/>
+                <w:sz w:val="20"/>
+                <w:szCs w:val="20"/>
+              </w:rPr>
+              <w:t xml:space="preserve">Daily summary</w:t>
+            </w:r>
+          </w:p>
+        </w:tc>
+        <w:tc>
+          <w:tcPr>
+            <w:tcW w:type="dxa" w:w="6326"/>
+            <w:tcBorders>
+              <w:top w:val="single" w:color="C9D3E6" w:sz="4"/>
+              <w:left w:val="single" w:color="C9D3E6" w:sz="4"/>
+              <w:bottom w:val="single" w:color="C9D3E6" w:sz="4"/>
+              <w:right w:val="single" w:color="C9D3E6" w:sz="4"/>
+            </w:tcBorders>
+            <w:shd w:fill="FFFFFF" w:color="auto" w:val="clear"/>
+            <w:tcMar>
+              <w:top w:type="dxa" w:w="80"/>
+              <w:left w:type="dxa" w:w="110"/>
+              <w:bottom w:type="dxa" w:w="80"/>
+              <w:right w:type="dxa" w:w="110"/>
+            </w:tcMar>
+          </w:tcPr>
+          <w:p>
+            <w:r>
+              <w:rPr>
+                <w:rFonts w:ascii="Arial" w:cs="Arial" w:eastAsia="Arial" w:hAnsi="Arial"/>
+                <w:sz w:val="20"/>
+                <w:szCs w:val="20"/>
+              </w:rPr>
+              <w:t xml:space="preserve">Sales, profit and best sellers, read out loud or sent on WhatsApp at the end of the day.</w:t>
+            </w:r>
+          </w:p>
+        </w:tc>
+      </w:tr>
+      <w:tr>
+        <w:trPr>
+          <w:cantSplit/>
+          <w:tblHeader w:val="false"/>
+        </w:trPr>
+        <w:tc>
+          <w:tcPr>
+            <w:tcW w:type="dxa" w:w="2700"/>
+            <w:tcBorders>
+              <w:top w:val="single" w:color="C9D3E6" w:sz="4"/>
+              <w:left w:val="single" w:color="C9D3E6" w:sz="4"/>
+              <w:bottom w:val="single" w:color="C9D3E6" w:sz="4"/>
+              <w:right w:val="single" w:color="C9D3E6" w:sz="4"/>
+            </w:tcBorders>
+            <w:shd w:fill="F6F8FC" w:color="auto" w:val="clear"/>
+            <w:tcMar>
+              <w:top w:type="dxa" w:w="80"/>
+              <w:left w:type="dxa" w:w="110"/>
+              <w:bottom w:type="dxa" w:w="80"/>
+              <w:right w:type="dxa" w:w="110"/>
+            </w:tcMar>
+          </w:tcPr>
+          <w:p>
+            <w:r>
+              <w:rPr>
+                <w:rFonts w:ascii="Arial" w:cs="Arial" w:eastAsia="Arial" w:hAnsi="Arial"/>
+                <w:sz w:val="20"/>
+                <w:szCs w:val="20"/>
+              </w:rPr>
               <w:t xml:space="preserve">Vendora Business Score</w:t>
             </w:r>
           </w:p>
@@ -1983,7 +2446,7 @@
               <w:bottom w:val="single" w:color="C9D3E6" w:sz="4"/>
               <w:right w:val="single" w:color="C9D3E6" w:sz="4"/>
             </w:tcBorders>
-            <w:shd w:fill="FFFFFF" w:color="auto" w:val="clear"/>
+            <w:shd w:fill="F6F8FC" w:color="auto" w:val="clear"/>
             <w:tcMar>
               <w:top w:type="dxa" w:w="80"/>
               <w:left w:type="dxa" w:w="110"/>
@@ -2544,6 +3007,68 @@
           </w:p>
         </w:tc>
       </w:tr>
+      <w:tr>
+        <w:trPr>
+          <w:cantSplit/>
+          <w:tblHeader w:val="false"/>
+        </w:trPr>
+        <w:tc>
+          <w:tcPr>
+            <w:tcW w:type="dxa" w:w="2700"/>
+            <w:tcBorders>
+              <w:top w:val="single" w:color="C9D3E6" w:sz="4"/>
+              <w:left w:val="single" w:color="C9D3E6" w:sz="4"/>
+              <w:bottom w:val="single" w:color="C9D3E6" w:sz="4"/>
+              <w:right w:val="single" w:color="C9D3E6" w:sz="4"/>
+            </w:tcBorders>
+            <w:shd w:fill="F6F8FC" w:color="auto" w:val="clear"/>
+            <w:tcMar>
+              <w:top w:type="dxa" w:w="80"/>
+              <w:left w:type="dxa" w:w="110"/>
+              <w:bottom w:type="dxa" w:w="80"/>
+              <w:right w:type="dxa" w:w="110"/>
+            </w:tcMar>
+          </w:tcPr>
+          <w:p>
+            <w:r>
+              <w:rPr>
+                <w:rFonts w:ascii="Arial" w:cs="Arial" w:eastAsia="Arial" w:hAnsi="Arial"/>
+                <w:sz w:val="20"/>
+                <w:szCs w:val="20"/>
+              </w:rPr>
+              <w:t xml:space="preserve">Records sent to Wema</w:t>
+            </w:r>
+          </w:p>
+        </w:tc>
+        <w:tc>
+          <w:tcPr>
+            <w:tcW w:type="dxa" w:w="6326"/>
+            <w:tcBorders>
+              <w:top w:val="single" w:color="C9D3E6" w:sz="4"/>
+              <w:left w:val="single" w:color="C9D3E6" w:sz="4"/>
+              <w:bottom w:val="single" w:color="C9D3E6" w:sz="4"/>
+              <w:right w:val="single" w:color="C9D3E6" w:sz="4"/>
+            </w:tcBorders>
+            <w:shd w:fill="F6F8FC" w:color="auto" w:val="clear"/>
+            <w:tcMar>
+              <w:top w:type="dxa" w:w="80"/>
+              <w:left w:type="dxa" w:w="110"/>
+              <w:bottom w:type="dxa" w:w="80"/>
+              <w:right w:type="dxa" w:w="110"/>
+            </w:tcMar>
+          </w:tcPr>
+          <w:p>
+            <w:r>
+              <w:rPr>
+                <w:rFonts w:ascii="Arial" w:cs="Arial" w:eastAsia="Arial" w:hAnsi="Arial"/>
+                <w:sz w:val="20"/>
+                <w:szCs w:val="20"/>
+              </w:rPr>
+              <w:t xml:space="preserve">One tap sends Wema an Excel file with every invoice, payment, delivery, debt, loan and the sealed record, so the Business Score can be checked against raw evidence.</w:t>
+            </w:r>
+          </w:p>
+        </w:tc>
+      </w:tr>
     </w:tbl>
     <w:p>
       <w:pPr>
@@ -2600,6 +3125,377 @@
     </w:p>
     <w:p>
       <w:pPr>
+        <w:pStyle w:val="Heading2"/>
+        <w:spacing w:after="100" w:before="200"/>
+      </w:pPr>
+      <w:r>
+        <w:rPr>
+          <w:rFonts w:ascii="Arial" w:cs="Arial" w:eastAsia="Arial" w:hAnsi="Arial"/>
+          <w:b/>
+          <w:bCs/>
+          <w:color w:val="1E5BD8"/>
+          <w:sz w:val="24"/>
+          <w:szCs w:val="24"/>
+        </w:rPr>
+        <w:t xml:space="preserve">The Vendors Hub: verified bulk sellers</w:t>
+      </w:r>
+    </w:p>
+    <w:p>
+      <w:pPr>
+        <w:spacing w:after="120" w:line="300"/>
+      </w:pPr>
+      <w:r>
+        <w:rPr>
+          <w:rFonts w:ascii="Arial" w:cs="Arial" w:eastAsia="Arial" w:hAnsi="Arial"/>
+          <w:sz w:val="22"/>
+          <w:szCs w:val="22"/>
+        </w:rPr>
+        <w:t xml:space="preserve">Traders restock from wholesalers they find by word of mouth, and often pay for goods that never arrive. The </w:t>
+      </w:r>
+      <w:r>
+        <w:rPr>
+          <w:rFonts w:ascii="Arial" w:cs="Arial" w:eastAsia="Arial" w:hAnsi="Arial"/>
+          <w:b/>
+          <w:bCs/>
+          <w:sz w:val="22"/>
+          <w:szCs w:val="22"/>
+        </w:rPr>
+        <w:t xml:space="preserve">Vendors Hub</w:t>
+      </w:r>
+      <w:r>
+        <w:rPr>
+          <w:rFonts w:ascii="Arial" w:cs="Arial" w:eastAsia="Arial" w:hAnsi="Arial"/>
+          <w:sz w:val="22"/>
+          <w:szCs w:val="22"/>
+        </w:rPr>
+        <w:t xml:space="preserve"> is a marketplace of verified bulk sellers inside Vendora:</w:t>
+      </w:r>
+    </w:p>
+    <w:p>
+      <w:pPr>
+        <w:pStyle w:val="ListParagraph"/>
+        <w:numPr>
+          <w:ilvl w:val="0"/>
+          <w:numId w:val="3"/>
+        </w:numPr>
+        <w:spacing w:after="80" w:line="290"/>
+      </w:pPr>
+      <w:r>
+        <w:rPr>
+          <w:rFonts w:ascii="Arial" w:cs="Arial" w:eastAsia="Arial" w:hAnsi="Arial"/>
+          <w:sz w:val="22"/>
+          <w:szCs w:val="22"/>
+        </w:rPr>
+        <w:t xml:space="preserve">Every seller has a </w:t>
+      </w:r>
+      <w:r>
+        <w:rPr>
+          <w:rFonts w:ascii="Arial" w:cs="Arial" w:eastAsia="Arial" w:hAnsi="Arial"/>
+          <w:b/>
+          <w:bCs/>
+          <w:sz w:val="22"/>
+          <w:szCs w:val="22"/>
+        </w:rPr>
+        <w:t xml:space="preserve">Wema-verified business account</w:t>
+      </w:r>
+      <w:r>
+        <w:rPr>
+          <w:rFonts w:ascii="Arial" w:cs="Arial" w:eastAsia="Arial" w:hAnsi="Arial"/>
+          <w:sz w:val="22"/>
+          <w:szCs w:val="22"/>
+        </w:rPr>
+        <w:t xml:space="preserve">, </w:t>
+      </w:r>
+      <w:r>
+        <w:rPr>
+          <w:rFonts w:ascii="Arial" w:cs="Arial" w:eastAsia="Arial" w:hAnsi="Arial"/>
+          <w:b/>
+          <w:bCs/>
+          <w:sz w:val="22"/>
+          <w:szCs w:val="22"/>
+        </w:rPr>
+        <w:t xml:space="preserve">CAC registration</w:t>
+      </w:r>
+      <w:r>
+        <w:rPr>
+          <w:rFonts w:ascii="Arial" w:cs="Arial" w:eastAsia="Arial" w:hAnsi="Arial"/>
+          <w:sz w:val="22"/>
+          <w:szCs w:val="22"/>
+        </w:rPr>
+        <w:t xml:space="preserve"> and a </w:t>
+      </w:r>
+      <w:r>
+        <w:rPr>
+          <w:rFonts w:ascii="Arial" w:cs="Arial" w:eastAsia="Arial" w:hAnsi="Arial"/>
+          <w:b/>
+          <w:bCs/>
+          <w:sz w:val="22"/>
+          <w:szCs w:val="22"/>
+        </w:rPr>
+        <w:t xml:space="preserve">delivery record</w:t>
+      </w:r>
+      <w:r>
+        <w:rPr>
+          <w:rFonts w:ascii="Arial" w:cs="Arial" w:eastAsia="Arial" w:hAnsi="Arial"/>
+          <w:sz w:val="22"/>
+          <w:szCs w:val="22"/>
+        </w:rPr>
+        <w:t xml:space="preserve"> confirmed by the traders who bought from them.</w:t>
+      </w:r>
+    </w:p>
+    <w:p>
+      <w:pPr>
+        <w:pStyle w:val="ListParagraph"/>
+        <w:numPr>
+          <w:ilvl w:val="0"/>
+          <w:numId w:val="3"/>
+        </w:numPr>
+        <w:spacing w:after="80" w:line="290"/>
+      </w:pPr>
+      <w:r>
+        <w:rPr>
+          <w:rFonts w:ascii="Arial" w:cs="Arial" w:eastAsia="Arial" w:hAnsi="Arial"/>
+          <w:sz w:val="22"/>
+          <w:szCs w:val="22"/>
+        </w:rPr>
+        <w:t xml:space="preserve">Traders search by item, seller or market, compare prices (for example "₦250 cheaper than you pay now"), see the distance from their shop and get directions.</w:t>
+      </w:r>
+    </w:p>
+    <w:p>
+      <w:pPr>
+        <w:pStyle w:val="ListParagraph"/>
+        <w:numPr>
+          <w:ilvl w:val="0"/>
+          <w:numId w:val="3"/>
+        </w:numPr>
+        <w:spacing w:after="80" w:line="290"/>
+      </w:pPr>
+      <w:r>
+        <w:rPr>
+          <w:rFonts w:ascii="Arial" w:cs="Arial" w:eastAsia="Arial" w:hAnsi="Arial"/>
+          <w:sz w:val="22"/>
+          <w:szCs w:val="22"/>
+        </w:rPr>
+        <w:t xml:space="preserve">They order in a few taps and pay from their Wema account or with a </w:t>
+      </w:r>
+      <w:r>
+        <w:rPr>
+          <w:rFonts w:ascii="Arial" w:cs="Arial" w:eastAsia="Arial" w:hAnsi="Arial"/>
+          <w:b/>
+          <w:bCs/>
+          <w:sz w:val="22"/>
+          <w:szCs w:val="22"/>
+        </w:rPr>
+        <w:t xml:space="preserve">Wema Restock Loan paid straight to the seller</w:t>
+      </w:r>
+      <w:r>
+        <w:rPr>
+          <w:rFonts w:ascii="Arial" w:cs="Arial" w:eastAsia="Arial" w:hAnsi="Arial"/>
+          <w:sz w:val="22"/>
+          <w:szCs w:val="22"/>
+        </w:rPr>
+        <w:t xml:space="preserve">. When the goods arrive, one tap ("I have received it") updates stock and adds a verified delivery to their records.</w:t>
+      </w:r>
+    </w:p>
+    <w:p>
+      <w:pPr>
+        <w:pStyle w:val="ListParagraph"/>
+        <w:numPr>
+          <w:ilvl w:val="0"/>
+          <w:numId w:val="3"/>
+        </w:numPr>
+        <w:spacing w:after="80" w:line="290"/>
+      </w:pPr>
+      <w:r>
+        <w:rPr>
+          <w:rFonts w:ascii="Arial" w:cs="Arial" w:eastAsia="Arial" w:hAnsi="Arial"/>
+          <w:sz w:val="22"/>
+          <w:szCs w:val="22"/>
+        </w:rPr>
+        <w:t xml:space="preserve">Vendora warns traders when an item will soon finish and shows the best verified offer for it.</w:t>
+      </w:r>
+    </w:p>
+    <w:p>
+      <w:pPr>
+        <w:pStyle w:val="ListParagraph"/>
+        <w:numPr>
+          <w:ilvl w:val="0"/>
+          <w:numId w:val="3"/>
+        </w:numPr>
+        <w:spacing w:after="80" w:line="290"/>
+      </w:pPr>
+      <w:r>
+        <w:rPr>
+          <w:rFonts w:ascii="Arial" w:cs="Arial" w:eastAsia="Arial" w:hAnsi="Arial"/>
+          <w:b/>
+          <w:bCs/>
+          <w:sz w:val="22"/>
+          <w:szCs w:val="22"/>
+        </w:rPr>
+        <w:t xml:space="preserve">Shop adverts:</w:t>
+      </w:r>
+      <w:r>
+        <w:rPr>
+          <w:rFonts w:ascii="Arial" w:cs="Arial" w:eastAsia="Arial" w:hAnsi="Arial"/>
+          <w:sz w:val="22"/>
+          <w:szCs w:val="22"/>
+        </w:rPr>
+        <w:t xml:space="preserve"> traders and sellers can advertise on the Hub with photos and a short video of their shop, a headline, their prices and their location.</w:t>
+      </w:r>
+    </w:p>
+    <w:p>
+      <w:pPr>
+        <w:pStyle w:val="Heading2"/>
+        <w:spacing w:after="100" w:before="200"/>
+      </w:pPr>
+      <w:r>
+        <w:rPr>
+          <w:rFonts w:ascii="Arial" w:cs="Arial" w:eastAsia="Arial" w:hAnsi="Arial"/>
+          <w:b/>
+          <w:bCs/>
+          <w:color w:val="1E5BD8"/>
+          <w:sz w:val="24"/>
+          <w:szCs w:val="24"/>
+        </w:rPr>
+        <w:t xml:space="preserve">CAC registration through Wema, without the stress</w:t>
+      </w:r>
+    </w:p>
+    <w:p>
+      <w:pPr>
+        <w:spacing w:after="120" w:line="300"/>
+      </w:pPr>
+      <w:r>
+        <w:rPr>
+          <w:rFonts w:ascii="Arial" w:cs="Arial" w:eastAsia="Arial" w:hAnsi="Arial"/>
+          <w:sz w:val="22"/>
+          <w:szCs w:val="22"/>
+        </w:rPr>
+        <w:t xml:space="preserve">Every seller on the Vendors Hub must be registered with the Corporate Affairs Commission (CAC). For most market traders, registration means time away from the shop, agents and a lump-sum fee. Vendora removes all three:</w:t>
+      </w:r>
+    </w:p>
+    <w:p>
+      <w:pPr>
+        <w:pStyle w:val="ListParagraph"/>
+        <w:numPr>
+          <w:ilvl w:val="0"/>
+          <w:numId w:val="4"/>
+        </w:numPr>
+        <w:spacing w:after="80" w:line="290"/>
+      </w:pPr>
+      <w:r>
+        <w:rPr>
+          <w:rFonts w:ascii="Arial" w:cs="Arial" w:eastAsia="Arial" w:hAnsi="Arial"/>
+          <w:sz w:val="22"/>
+          <w:szCs w:val="22"/>
+        </w:rPr>
+        <w:t xml:space="preserve">The app first explains </w:t>
+      </w:r>
+      <w:r>
+        <w:rPr>
+          <w:rFonts w:ascii="Arial" w:cs="Arial" w:eastAsia="Arial" w:hAnsi="Arial"/>
+          <w:b/>
+          <w:bCs/>
+          <w:sz w:val="22"/>
+          <w:szCs w:val="22"/>
+        </w:rPr>
+        <w:t xml:space="preserve">in simple words why registration matters</w:t>
+      </w:r>
+      <w:r>
+        <w:rPr>
+          <w:rFonts w:ascii="Arial" w:cs="Arial" w:eastAsia="Arial" w:hAnsi="Arial"/>
+          <w:sz w:val="22"/>
+          <w:szCs w:val="22"/>
+        </w:rPr>
+        <w:t xml:space="preserve">: the business name becomes theirs by law, buyers and big suppliers trust a CAC badge, banks lend more to registered businesses, companies and supermarkets only buy from registered sellers, and most grants ask for a CAC number.</w:t>
+      </w:r>
+    </w:p>
+    <w:p>
+      <w:pPr>
+        <w:pStyle w:val="ListParagraph"/>
+        <w:numPr>
+          <w:ilvl w:val="0"/>
+          <w:numId w:val="4"/>
+        </w:numPr>
+        <w:spacing w:after="80" w:line="290"/>
+      </w:pPr>
+      <w:r>
+        <w:rPr>
+          <w:rFonts w:ascii="Arial" w:cs="Arial" w:eastAsia="Arial" w:hAnsi="Arial"/>
+          <w:sz w:val="22"/>
+          <w:szCs w:val="22"/>
+        </w:rPr>
+        <w:t xml:space="preserve">The trader picks a small daily amount (₦200 to ₦2,000). Wema keeps it aside from their account every day, like ajo. They can add more, pause, or take the money back at any time.</w:t>
+      </w:r>
+    </w:p>
+    <w:p>
+      <w:pPr>
+        <w:pStyle w:val="ListParagraph"/>
+        <w:numPr>
+          <w:ilvl w:val="0"/>
+          <w:numId w:val="4"/>
+        </w:numPr>
+        <w:spacing w:after="80" w:line="290"/>
+      </w:pPr>
+      <w:r>
+        <w:rPr>
+          <w:rFonts w:ascii="Arial" w:cs="Arial" w:eastAsia="Arial" w:hAnsi="Arial"/>
+          <w:sz w:val="22"/>
+          <w:szCs w:val="22"/>
+        </w:rPr>
+        <w:t xml:space="preserve">When the money is complete, the trader fills one short form in the app. Wema files the registration with CAC for them, and the app shows each step until the business is registered.</w:t>
+      </w:r>
+    </w:p>
+    <w:p>
+      <w:pPr>
+        <w:pStyle w:val="ListParagraph"/>
+        <w:numPr>
+          <w:ilvl w:val="0"/>
+          <w:numId w:val="4"/>
+        </w:numPr>
+        <w:spacing w:after="80" w:line="290"/>
+      </w:pPr>
+      <w:r>
+        <w:rPr>
+          <w:rFonts w:ascii="Arial" w:cs="Arial" w:eastAsia="Arial" w:hAnsi="Arial"/>
+          <w:sz w:val="22"/>
+          <w:szCs w:val="22"/>
+        </w:rPr>
+        <w:t xml:space="preserve">The CAC number then appears on the trader's invoices and Hub advert.</w:t>
+      </w:r>
+    </w:p>
+    <w:p>
+      <w:pPr>
+        <w:spacing w:after="120" w:line="300"/>
+      </w:pPr>
+      <w:r>
+        <w:rPr>
+          <w:rFonts w:ascii="Arial" w:cs="Arial" w:eastAsia="Arial" w:hAnsi="Arial"/>
+          <w:sz w:val="22"/>
+          <w:szCs w:val="22"/>
+        </w:rPr>
+        <w:t xml:space="preserve">The target is currently an estimated </w:t>
+      </w:r>
+      <w:r>
+        <w:rPr>
+          <w:rFonts w:ascii="Arial" w:cs="Arial" w:eastAsia="Arial" w:hAnsi="Arial"/>
+          <w:b/>
+          <w:bCs/>
+          <w:sz w:val="22"/>
+          <w:szCs w:val="22"/>
+        </w:rPr>
+        <w:t xml:space="preserve">₦25,000</w:t>
+      </w:r>
+      <w:r>
+        <w:rPr>
+          <w:rFonts w:ascii="Arial" w:cs="Arial" w:eastAsia="Arial" w:hAnsi="Arial"/>
+          <w:sz w:val="22"/>
+          <w:szCs w:val="22"/>
+        </w:rPr>
+        <w:t xml:space="preserve"> for CAC filing; Wema confirms the exact amount before filing and returns anything left over. Traders who already have a CAC number simply enter it.</w:t>
+      </w:r>
+    </w:p>
+    <w:p>
+      <w:pPr>
         <w:pStyle w:val="Heading1"/>
         <w:pBdr>
           <w:bottom w:val="single" w:color="F5B800" w:sz="8" w:space="4"/>
@@ -2615,7 +3511,649 @@
           <w:sz w:val="30"/>
           <w:szCs w:val="30"/>
         </w:rPr>
-        <w:t xml:space="preserve">5. How Vendora works with Wema Bank</w:t>
+        <w:t xml:space="preserve">5. Records Wema can trust</w:t>
+      </w:r>
+    </w:p>
+    <w:p>
+      <w:pPr>
+        <w:spacing w:after="120" w:line="300"/>
+      </w:pPr>
+      <w:r>
+        <w:rPr>
+          <w:rFonts w:ascii="Arial" w:cs="Arial" w:eastAsia="Arial" w:hAnsi="Arial"/>
+          <w:sz w:val="22"/>
+          <w:szCs w:val="22"/>
+        </w:rPr>
+        <w:t xml:space="preserve">A Business Score is only useful if the records behind it are real. Vendora is built so that faking or quietly changing sales is hard, and visible when someone tries:</w:t>
+      </w:r>
+    </w:p>
+    <w:tbl>
+      <w:tblPr>
+        <w:tblW w:type="dxa" w:w="9026"/>
+        <w:tblBorders>
+          <w:top w:val="single" w:color="auto" w:sz="4"/>
+          <w:left w:val="single" w:color="auto" w:sz="4"/>
+          <w:bottom w:val="single" w:color="auto" w:sz="4"/>
+          <w:right w:val="single" w:color="auto" w:sz="4"/>
+          <w:insideH w:val="single" w:color="auto" w:sz="4"/>
+          <w:insideV w:val="single" w:color="auto" w:sz="4"/>
+        </w:tblBorders>
+      </w:tblPr>
+      <w:tblGrid>
+        <w:gridCol w:w="2600"/>
+        <w:gridCol w:w="6426"/>
+      </w:tblGrid>
+      <w:tr>
+        <w:trPr>
+          <w:cantSplit/>
+          <w:tblHeader/>
+        </w:trPr>
+        <w:tc>
+          <w:tcPr>
+            <w:tcW w:type="dxa" w:w="2600"/>
+            <w:tcBorders>
+              <w:top w:val="single" w:color="C9D3E6" w:sz="4"/>
+              <w:left w:val="single" w:color="C9D3E6" w:sz="4"/>
+              <w:bottom w:val="single" w:color="C9D3E6" w:sz="4"/>
+              <w:right w:val="single" w:color="C9D3E6" w:sz="4"/>
+            </w:tcBorders>
+            <w:shd w:fill="0B2A6B" w:color="auto" w:val="clear"/>
+            <w:tcMar>
+              <w:top w:type="dxa" w:w="80"/>
+              <w:left w:type="dxa" w:w="110"/>
+              <w:bottom w:type="dxa" w:w="80"/>
+              <w:right w:type="dxa" w:w="110"/>
+            </w:tcMar>
+          </w:tcPr>
+          <w:p>
+            <w:r>
+              <w:rPr>
+                <w:rFonts w:ascii="Arial" w:cs="Arial" w:eastAsia="Arial" w:hAnsi="Arial"/>
+                <w:b/>
+                <w:bCs/>
+                <w:color w:val="FFFFFF"/>
+                <w:sz w:val="20"/>
+                <w:szCs w:val="20"/>
+              </w:rPr>
+              <w:t xml:space="preserve">Protection</w:t>
+            </w:r>
+          </w:p>
+        </w:tc>
+        <w:tc>
+          <w:tcPr>
+            <w:tcW w:type="dxa" w:w="6426"/>
+            <w:tcBorders>
+              <w:top w:val="single" w:color="C9D3E6" w:sz="4"/>
+              <w:left w:val="single" w:color="C9D3E6" w:sz="4"/>
+              <w:bottom w:val="single" w:color="C9D3E6" w:sz="4"/>
+              <w:right w:val="single" w:color="C9D3E6" w:sz="4"/>
+            </w:tcBorders>
+            <w:shd w:fill="0B2A6B" w:color="auto" w:val="clear"/>
+            <w:tcMar>
+              <w:top w:type="dxa" w:w="80"/>
+              <w:left w:type="dxa" w:w="110"/>
+              <w:bottom w:type="dxa" w:w="80"/>
+              <w:right w:type="dxa" w:w="110"/>
+            </w:tcMar>
+          </w:tcPr>
+          <w:p>
+            <w:r>
+              <w:rPr>
+                <w:rFonts w:ascii="Arial" w:cs="Arial" w:eastAsia="Arial" w:hAnsi="Arial"/>
+                <w:b/>
+                <w:bCs/>
+                <w:color w:val="FFFFFF"/>
+                <w:sz w:val="20"/>
+                <w:szCs w:val="20"/>
+              </w:rPr>
+              <w:t xml:space="preserve">How it works</w:t>
+            </w:r>
+          </w:p>
+        </w:tc>
+      </w:tr>
+      <w:tr>
+        <w:trPr>
+          <w:cantSplit/>
+          <w:tblHeader w:val="false"/>
+        </w:trPr>
+        <w:tc>
+          <w:tcPr>
+            <w:tcW w:type="dxa" w:w="2600"/>
+            <w:tcBorders>
+              <w:top w:val="single" w:color="C9D3E6" w:sz="4"/>
+              <w:left w:val="single" w:color="C9D3E6" w:sz="4"/>
+              <w:bottom w:val="single" w:color="C9D3E6" w:sz="4"/>
+              <w:right w:val="single" w:color="C9D3E6" w:sz="4"/>
+            </w:tcBorders>
+            <w:shd w:fill="FFFFFF" w:color="auto" w:val="clear"/>
+            <w:tcMar>
+              <w:top w:type="dxa" w:w="80"/>
+              <w:left w:type="dxa" w:w="110"/>
+              <w:bottom w:type="dxa" w:w="80"/>
+              <w:right w:type="dxa" w:w="110"/>
+            </w:tcMar>
+          </w:tcPr>
+          <w:p>
+            <w:r>
+              <w:rPr>
+                <w:rFonts w:ascii="Arial" w:cs="Arial" w:eastAsia="Arial" w:hAnsi="Arial"/>
+                <w:sz w:val="20"/>
+                <w:szCs w:val="20"/>
+              </w:rPr>
+              <w:t xml:space="preserve">Sealed records</w:t>
+            </w:r>
+          </w:p>
+        </w:tc>
+        <w:tc>
+          <w:tcPr>
+            <w:tcW w:type="dxa" w:w="6426"/>
+            <w:tcBorders>
+              <w:top w:val="single" w:color="C9D3E6" w:sz="4"/>
+              <w:left w:val="single" w:color="C9D3E6" w:sz="4"/>
+              <w:bottom w:val="single" w:color="C9D3E6" w:sz="4"/>
+              <w:right w:val="single" w:color="C9D3E6" w:sz="4"/>
+            </w:tcBorders>
+            <w:shd w:fill="FFFFFF" w:color="auto" w:val="clear"/>
+            <w:tcMar>
+              <w:top w:type="dxa" w:w="80"/>
+              <w:left w:type="dxa" w:w="110"/>
+              <w:bottom w:type="dxa" w:w="80"/>
+              <w:right w:type="dxa" w:w="110"/>
+            </w:tcMar>
+          </w:tcPr>
+          <w:p>
+            <w:r>
+              <w:rPr>
+                <w:rFonts w:ascii="Arial" w:cs="Arial" w:eastAsia="Arial" w:hAnsi="Arial"/>
+                <w:sz w:val="20"/>
+                <w:szCs w:val="20"/>
+              </w:rPr>
+              <w:t xml:space="preserve">Every sale, restock, payment and correction is added to a chain where each entry carries a digital fingerprint (SHA-256) of the one before. Changing or deleting any past record breaks the seal.</w:t>
+            </w:r>
+          </w:p>
+        </w:tc>
+      </w:tr>
+      <w:tr>
+        <w:trPr>
+          <w:cantSplit/>
+          <w:tblHeader w:val="false"/>
+        </w:trPr>
+        <w:tc>
+          <w:tcPr>
+            <w:tcW w:type="dxa" w:w="2600"/>
+            <w:tcBorders>
+              <w:top w:val="single" w:color="C9D3E6" w:sz="4"/>
+              <w:left w:val="single" w:color="C9D3E6" w:sz="4"/>
+              <w:bottom w:val="single" w:color="C9D3E6" w:sz="4"/>
+              <w:right w:val="single" w:color="C9D3E6" w:sz="4"/>
+            </w:tcBorders>
+            <w:shd w:fill="F6F8FC" w:color="auto" w:val="clear"/>
+            <w:tcMar>
+              <w:top w:type="dxa" w:w="80"/>
+              <w:left w:type="dxa" w:w="110"/>
+              <w:bottom w:type="dxa" w:w="80"/>
+              <w:right w:type="dxa" w:w="110"/>
+            </w:tcMar>
+          </w:tcPr>
+          <w:p>
+            <w:r>
+              <w:rPr>
+                <w:rFonts w:ascii="Arial" w:cs="Arial" w:eastAsia="Arial" w:hAnsi="Arial"/>
+                <w:sz w:val="20"/>
+                <w:szCs w:val="20"/>
+              </w:rPr>
+              <w:t xml:space="preserve">Signed on the phone</w:t>
+            </w:r>
+          </w:p>
+        </w:tc>
+        <w:tc>
+          <w:tcPr>
+            <w:tcW w:type="dxa" w:w="6426"/>
+            <w:tcBorders>
+              <w:top w:val="single" w:color="C9D3E6" w:sz="4"/>
+              <w:left w:val="single" w:color="C9D3E6" w:sz="4"/>
+              <w:bottom w:val="single" w:color="C9D3E6" w:sz="4"/>
+              <w:right w:val="single" w:color="C9D3E6" w:sz="4"/>
+            </w:tcBorders>
+            <w:shd w:fill="F6F8FC" w:color="auto" w:val="clear"/>
+            <w:tcMar>
+              <w:top w:type="dxa" w:w="80"/>
+              <w:left w:type="dxa" w:w="110"/>
+              <w:bottom w:type="dxa" w:w="80"/>
+              <w:right w:type="dxa" w:w="110"/>
+            </w:tcMar>
+          </w:tcPr>
+          <w:p>
+            <w:r>
+              <w:rPr>
+                <w:rFonts w:ascii="Arial" w:cs="Arial" w:eastAsia="Arial" w:hAnsi="Arial"/>
+                <w:sz w:val="20"/>
+                <w:szCs w:val="20"/>
+              </w:rPr>
+              <w:t xml:space="preserve">Each entry is signed with a key that never leaves the trader's phone, so records cannot be made up on another device.</w:t>
+            </w:r>
+          </w:p>
+        </w:tc>
+      </w:tr>
+      <w:tr>
+        <w:trPr>
+          <w:cantSplit/>
+          <w:tblHeader w:val="false"/>
+        </w:trPr>
+        <w:tc>
+          <w:tcPr>
+            <w:tcW w:type="dxa" w:w="2600"/>
+            <w:tcBorders>
+              <w:top w:val="single" w:color="C9D3E6" w:sz="4"/>
+              <w:left w:val="single" w:color="C9D3E6" w:sz="4"/>
+              <w:bottom w:val="single" w:color="C9D3E6" w:sz="4"/>
+              <w:right w:val="single" w:color="C9D3E6" w:sz="4"/>
+            </w:tcBorders>
+            <w:shd w:fill="FFFFFF" w:color="auto" w:val="clear"/>
+            <w:tcMar>
+              <w:top w:type="dxa" w:w="80"/>
+              <w:left w:type="dxa" w:w="110"/>
+              <w:bottom w:type="dxa" w:w="80"/>
+              <w:right w:type="dxa" w:w="110"/>
+            </w:tcMar>
+          </w:tcPr>
+          <w:p>
+            <w:r>
+              <w:rPr>
+                <w:rFonts w:ascii="Arial" w:cs="Arial" w:eastAsia="Arial" w:hAnsi="Arial"/>
+                <w:sz w:val="20"/>
+                <w:szCs w:val="20"/>
+              </w:rPr>
+              <w:t xml:space="preserve">Mistakes are cancelled, never deleted</w:t>
+            </w:r>
+          </w:p>
+        </w:tc>
+        <w:tc>
+          <w:tcPr>
+            <w:tcW w:type="dxa" w:w="6426"/>
+            <w:tcBorders>
+              <w:top w:val="single" w:color="C9D3E6" w:sz="4"/>
+              <w:left w:val="single" w:color="C9D3E6" w:sz="4"/>
+              <w:bottom w:val="single" w:color="C9D3E6" w:sz="4"/>
+              <w:right w:val="single" w:color="C9D3E6" w:sz="4"/>
+            </w:tcBorders>
+            <w:shd w:fill="FFFFFF" w:color="auto" w:val="clear"/>
+            <w:tcMar>
+              <w:top w:type="dxa" w:w="80"/>
+              <w:left w:type="dxa" w:w="110"/>
+              <w:bottom w:type="dxa" w:w="80"/>
+              <w:right w:type="dxa" w:w="110"/>
+            </w:tcMar>
+          </w:tcPr>
+          <w:p>
+            <w:r>
+              <w:rPr>
+                <w:rFonts w:ascii="Arial" w:cs="Arial" w:eastAsia="Arial" w:hAnsi="Arial"/>
+                <w:sz w:val="20"/>
+                <w:szCs w:val="20"/>
+              </w:rPr>
+              <w:t xml:space="preserve">A wrong entry is reversed with a visible cancellation. Both stay on the record for the owner and for Wema.</w:t>
+            </w:r>
+          </w:p>
+        </w:tc>
+      </w:tr>
+      <w:tr>
+        <w:trPr>
+          <w:cantSplit/>
+          <w:tblHeader w:val="false"/>
+        </w:trPr>
+        <w:tc>
+          <w:tcPr>
+            <w:tcW w:type="dxa" w:w="2600"/>
+            <w:tcBorders>
+              <w:top w:val="single" w:color="C9D3E6" w:sz="4"/>
+              <w:left w:val="single" w:color="C9D3E6" w:sz="4"/>
+              <w:bottom w:val="single" w:color="C9D3E6" w:sz="4"/>
+              <w:right w:val="single" w:color="C9D3E6" w:sz="4"/>
+            </w:tcBorders>
+            <w:shd w:fill="F6F8FC" w:color="auto" w:val="clear"/>
+            <w:tcMar>
+              <w:top w:type="dxa" w:w="80"/>
+              <w:left w:type="dxa" w:w="110"/>
+              <w:bottom w:type="dxa" w:w="80"/>
+              <w:right w:type="dxa" w:w="110"/>
+            </w:tcMar>
+          </w:tcPr>
+          <w:p>
+            <w:r>
+              <w:rPr>
+                <w:rFonts w:ascii="Arial" w:cs="Arial" w:eastAsia="Arial" w:hAnsi="Arial"/>
+                <w:sz w:val="20"/>
+                <w:szCs w:val="20"/>
+              </w:rPr>
+              <w:t xml:space="preserve">Proof level for every sale</w:t>
+            </w:r>
+          </w:p>
+        </w:tc>
+        <w:tc>
+          <w:tcPr>
+            <w:tcW w:type="dxa" w:w="6426"/>
+            <w:tcBorders>
+              <w:top w:val="single" w:color="C9D3E6" w:sz="4"/>
+              <w:left w:val="single" w:color="C9D3E6" w:sz="4"/>
+              <w:bottom w:val="single" w:color="C9D3E6" w:sz="4"/>
+              <w:right w:val="single" w:color="C9D3E6" w:sz="4"/>
+            </w:tcBorders>
+            <w:shd w:fill="F6F8FC" w:color="auto" w:val="clear"/>
+            <w:tcMar>
+              <w:top w:type="dxa" w:w="80"/>
+              <w:left w:type="dxa" w:w="110"/>
+              <w:bottom w:type="dxa" w:w="80"/>
+              <w:right w:type="dxa" w:w="110"/>
+            </w:tcMar>
+          </w:tcPr>
+          <w:p>
+            <w:r>
+              <w:rPr>
+                <w:rFonts w:ascii="Arial" w:cs="Arial" w:eastAsia="Arial" w:hAnsi="Arial"/>
+                <w:sz w:val="20"/>
+                <w:szCs w:val="20"/>
+              </w:rPr>
+              <w:t xml:space="preserve">Each sale is marked: confirmed by Wema, receipt checked with Wema, verified seller delivery, recorded live (voice, till, WhatsApp) or typed. Only money or goods that actually moved count as "confirmed", and that share feeds the score.</w:t>
+            </w:r>
+          </w:p>
+        </w:tc>
+      </w:tr>
+      <w:tr>
+        <w:trPr>
+          <w:cantSplit/>
+          <w:tblHeader w:val="false"/>
+        </w:trPr>
+        <w:tc>
+          <w:tcPr>
+            <w:tcW w:type="dxa" w:w="2600"/>
+            <w:tcBorders>
+              <w:top w:val="single" w:color="C9D3E6" w:sz="4"/>
+              <w:left w:val="single" w:color="C9D3E6" w:sz="4"/>
+              <w:bottom w:val="single" w:color="C9D3E6" w:sz="4"/>
+              <w:right w:val="single" w:color="C9D3E6" w:sz="4"/>
+            </w:tcBorders>
+            <w:shd w:fill="FFFFFF" w:color="auto" w:val="clear"/>
+            <w:tcMar>
+              <w:top w:type="dxa" w:w="80"/>
+              <w:left w:type="dxa" w:w="110"/>
+              <w:bottom w:type="dxa" w:w="80"/>
+              <w:right w:type="dxa" w:w="110"/>
+            </w:tcMar>
+          </w:tcPr>
+          <w:p>
+            <w:r>
+              <w:rPr>
+                <w:rFonts w:ascii="Arial" w:cs="Arial" w:eastAsia="Arial" w:hAnsi="Arial"/>
+                <w:sz w:val="20"/>
+                <w:szCs w:val="20"/>
+              </w:rPr>
+              <w:t xml:space="preserve">Receipts used once</w:t>
+            </w:r>
+          </w:p>
+        </w:tc>
+        <w:tc>
+          <w:tcPr>
+            <w:tcW w:type="dxa" w:w="6426"/>
+            <w:tcBorders>
+              <w:top w:val="single" w:color="C9D3E6" w:sz="4"/>
+              <w:left w:val="single" w:color="C9D3E6" w:sz="4"/>
+              <w:bottom w:val="single" w:color="C9D3E6" w:sz="4"/>
+              <w:right w:val="single" w:color="C9D3E6" w:sz="4"/>
+            </w:tcBorders>
+            <w:shd w:fill="FFFFFF" w:color="auto" w:val="clear"/>
+            <w:tcMar>
+              <w:top w:type="dxa" w:w="80"/>
+              <w:left w:type="dxa" w:w="110"/>
+              <w:bottom w:type="dxa" w:w="80"/>
+              <w:right w:type="dxa" w:w="110"/>
+            </w:tcMar>
+          </w:tcPr>
+          <w:p>
+            <w:r>
+              <w:rPr>
+                <w:rFonts w:ascii="Arial" w:cs="Arial" w:eastAsia="Arial" w:hAnsi="Arial"/>
+                <w:sz w:val="20"/>
+                <w:szCs w:val="20"/>
+              </w:rPr>
+              <w:t xml:space="preserve">The same receipt (by reference number or by picture) can never be used twice. Failed checks are recorded.</w:t>
+            </w:r>
+          </w:p>
+        </w:tc>
+      </w:tr>
+      <w:tr>
+        <w:trPr>
+          <w:cantSplit/>
+          <w:tblHeader w:val="false"/>
+        </w:trPr>
+        <w:tc>
+          <w:tcPr>
+            <w:tcW w:type="dxa" w:w="2600"/>
+            <w:tcBorders>
+              <w:top w:val="single" w:color="C9D3E6" w:sz="4"/>
+              <w:left w:val="single" w:color="C9D3E6" w:sz="4"/>
+              <w:bottom w:val="single" w:color="C9D3E6" w:sz="4"/>
+              <w:right w:val="single" w:color="C9D3E6" w:sz="4"/>
+            </w:tcBorders>
+            <w:shd w:fill="F6F8FC" w:color="auto" w:val="clear"/>
+            <w:tcMar>
+              <w:top w:type="dxa" w:w="80"/>
+              <w:left w:type="dxa" w:w="110"/>
+              <w:bottom w:type="dxa" w:w="80"/>
+              <w:right w:type="dxa" w:w="110"/>
+            </w:tcMar>
+          </w:tcPr>
+          <w:p>
+            <w:r>
+              <w:rPr>
+                <w:rFonts w:ascii="Arial" w:cs="Arial" w:eastAsia="Arial" w:hAnsi="Arial"/>
+                <w:sz w:val="20"/>
+                <w:szCs w:val="20"/>
+              </w:rPr>
+              <w:t xml:space="preserve">Time only moves forward</w:t>
+            </w:r>
+          </w:p>
+        </w:tc>
+        <w:tc>
+          <w:tcPr>
+            <w:tcW w:type="dxa" w:w="6426"/>
+            <w:tcBorders>
+              <w:top w:val="single" w:color="C9D3E6" w:sz="4"/>
+              <w:left w:val="single" w:color="C9D3E6" w:sz="4"/>
+              <w:bottom w:val="single" w:color="C9D3E6" w:sz="4"/>
+              <w:right w:val="single" w:color="C9D3E6" w:sz="4"/>
+            </w:tcBorders>
+            <w:shd w:fill="F6F8FC" w:color="auto" w:val="clear"/>
+            <w:tcMar>
+              <w:top w:type="dxa" w:w="80"/>
+              <w:left w:type="dxa" w:w="110"/>
+              <w:bottom w:type="dxa" w:w="80"/>
+              <w:right w:type="dxa" w:w="110"/>
+            </w:tcMar>
+          </w:tcPr>
+          <w:p>
+            <w:r>
+              <w:rPr>
+                <w:rFonts w:ascii="Arial" w:cs="Arial" w:eastAsia="Arial" w:hAnsi="Arial"/>
+                <w:sz w:val="20"/>
+                <w:szCs w:val="20"/>
+              </w:rPr>
+              <w:t xml:space="preserve">An entry dated before the previous one, for example after changing the phone's clock, is flagged.</w:t>
+            </w:r>
+          </w:p>
+        </w:tc>
+      </w:tr>
+      <w:tr>
+        <w:trPr>
+          <w:cantSplit/>
+          <w:tblHeader w:val="false"/>
+        </w:trPr>
+        <w:tc>
+          <w:tcPr>
+            <w:tcW w:type="dxa" w:w="2600"/>
+            <w:tcBorders>
+              <w:top w:val="single" w:color="C9D3E6" w:sz="4"/>
+              <w:left w:val="single" w:color="C9D3E6" w:sz="4"/>
+              <w:bottom w:val="single" w:color="C9D3E6" w:sz="4"/>
+              <w:right w:val="single" w:color="C9D3E6" w:sz="4"/>
+            </w:tcBorders>
+            <w:shd w:fill="FFFFFF" w:color="auto" w:val="clear"/>
+            <w:tcMar>
+              <w:top w:type="dxa" w:w="80"/>
+              <w:left w:type="dxa" w:w="110"/>
+              <w:bottom w:type="dxa" w:w="80"/>
+              <w:right w:type="dxa" w:w="110"/>
+            </w:tcMar>
+          </w:tcPr>
+          <w:p>
+            <w:r>
+              <w:rPr>
+                <w:rFonts w:ascii="Arial" w:cs="Arial" w:eastAsia="Arial" w:hAnsi="Arial"/>
+                <w:sz w:val="20"/>
+                <w:szCs w:val="20"/>
+              </w:rPr>
+              <w:t xml:space="preserve">Copy held online</w:t>
+            </w:r>
+          </w:p>
+        </w:tc>
+        <w:tc>
+          <w:tcPr>
+            <w:tcW w:type="dxa" w:w="6426"/>
+            <w:tcBorders>
+              <w:top w:val="single" w:color="C9D3E6" w:sz="4"/>
+              <w:left w:val="single" w:color="C9D3E6" w:sz="4"/>
+              <w:bottom w:val="single" w:color="C9D3E6" w:sz="4"/>
+              <w:right w:val="single" w:color="C9D3E6" w:sz="4"/>
+            </w:tcBorders>
+            <w:shd w:fill="FFFFFF" w:color="auto" w:val="clear"/>
+            <w:tcMar>
+              <w:top w:type="dxa" w:w="80"/>
+              <w:left w:type="dxa" w:w="110"/>
+              <w:bottom w:type="dxa" w:w="80"/>
+              <w:right w:type="dxa" w:w="110"/>
+            </w:tcMar>
+          </w:tcPr>
+          <w:p>
+            <w:r>
+              <w:rPr>
+                <w:rFonts w:ascii="Arial" w:cs="Arial" w:eastAsia="Arial" w:hAnsi="Arial"/>
+                <w:sz w:val="20"/>
+                <w:szCs w:val="20"/>
+              </w:rPr>
+              <w:t xml:space="preserve">Each time the phone syncs, the server keeps the latest seal. A shorter or rewritten history is caught.</w:t>
+            </w:r>
+          </w:p>
+        </w:tc>
+      </w:tr>
+      <w:tr>
+        <w:trPr>
+          <w:cantSplit/>
+          <w:tblHeader w:val="false"/>
+        </w:trPr>
+        <w:tc>
+          <w:tcPr>
+            <w:tcW w:type="dxa" w:w="2600"/>
+            <w:tcBorders>
+              <w:top w:val="single" w:color="C9D3E6" w:sz="4"/>
+              <w:left w:val="single" w:color="C9D3E6" w:sz="4"/>
+              <w:bottom w:val="single" w:color="C9D3E6" w:sz="4"/>
+              <w:right w:val="single" w:color="C9D3E6" w:sz="4"/>
+            </w:tcBorders>
+            <w:shd w:fill="F6F8FC" w:color="auto" w:val="clear"/>
+            <w:tcMar>
+              <w:top w:type="dxa" w:w="80"/>
+              <w:left w:type="dxa" w:w="110"/>
+              <w:bottom w:type="dxa" w:w="80"/>
+              <w:right w:type="dxa" w:w="110"/>
+            </w:tcMar>
+          </w:tcPr>
+          <w:p>
+            <w:r>
+              <w:rPr>
+                <w:rFonts w:ascii="Arial" w:cs="Arial" w:eastAsia="Arial" w:hAnsi="Arial"/>
+                <w:sz w:val="20"/>
+                <w:szCs w:val="20"/>
+              </w:rPr>
+              <w:t xml:space="preserve">Consequence</w:t>
+            </w:r>
+          </w:p>
+        </w:tc>
+        <w:tc>
+          <w:tcPr>
+            <w:tcW w:type="dxa" w:w="6426"/>
+            <w:tcBorders>
+              <w:top w:val="single" w:color="C9D3E6" w:sz="4"/>
+              <w:left w:val="single" w:color="C9D3E6" w:sz="4"/>
+              <w:bottom w:val="single" w:color="C9D3E6" w:sz="4"/>
+              <w:right w:val="single" w:color="C9D3E6" w:sz="4"/>
+            </w:tcBorders>
+            <w:shd w:fill="F6F8FC" w:color="auto" w:val="clear"/>
+            <w:tcMar>
+              <w:top w:type="dxa" w:w="80"/>
+              <w:left w:type="dxa" w:w="110"/>
+              <w:bottom w:type="dxa" w:w="80"/>
+              <w:right w:type="dxa" w:w="110"/>
+            </w:tcMar>
+          </w:tcPr>
+          <w:p>
+            <w:r>
+              <w:rPr>
+                <w:rFonts w:ascii="Arial" w:cs="Arial" w:eastAsia="Arial" w:hAnsi="Arial"/>
+                <w:sz w:val="20"/>
+                <w:szCs w:val="20"/>
+              </w:rPr>
+              <w:t xml:space="preserve">If records were changed, the app shows it, the score is capped at 25 and loans are paused until Wema reviews them.</w:t>
+            </w:r>
+          </w:p>
+        </w:tc>
+      </w:tr>
+    </w:tbl>
+    <w:p>
+      <w:pPr>
+        <w:spacing w:after="60"/>
+      </w:pPr>
+    </w:p>
+    <w:p>
+      <w:pPr>
+        <w:spacing w:after="120" w:line="300"/>
+      </w:pPr>
+      <w:r>
+        <w:rPr>
+          <w:rFonts w:ascii="Arial" w:cs="Arial" w:eastAsia="Arial" w:hAnsi="Arial"/>
+          <w:b/>
+          <w:bCs/>
+          <w:sz w:val="22"/>
+          <w:szCs w:val="22"/>
+        </w:rPr>
+        <w:t xml:space="preserve">The evidence file.</w:t>
+      </w:r>
+      <w:r>
+        <w:rPr>
+          <w:rFonts w:ascii="Arial" w:cs="Arial" w:eastAsia="Arial" w:hAnsi="Arial"/>
+          <w:sz w:val="22"/>
+          <w:szCs w:val="22"/>
+        </w:rPr>
+        <w:t xml:space="preserve"> With the trader's consent, Vendora sends Wema an Excel workbook for any period: a summary (business, owner, Wema account, GPS location, CAC status, score), every invoice and item, money Wema confirmed, verified deliveries, debts, loans and the full sealed record. The file's fingerprint is saved in the trader's records when it is sent, so it cannot be edited afterwards, and the server rejects any file that does not match its fingerprint.</w:t>
+      </w:r>
+    </w:p>
+    <w:p>
+      <w:pPr>
+        <w:pStyle w:val="Heading1"/>
+        <w:pBdr>
+          <w:bottom w:val="single" w:color="F5B800" w:sz="8" w:space="4"/>
+        </w:pBdr>
+        <w:spacing w:after="140" w:before="280"/>
+      </w:pPr>
+      <w:r>
+        <w:rPr>
+          <w:rFonts w:ascii="Arial" w:cs="Arial" w:eastAsia="Arial" w:hAnsi="Arial"/>
+          <w:b/>
+          <w:bCs/>
+          <w:color w:val="0B2A6B"/>
+          <w:sz w:val="30"/>
+          <w:szCs w:val="30"/>
+        </w:rPr>
+        <w:t xml:space="preserve">6. How Vendora works with Wema Bank</w:t>
       </w:r>
     </w:p>
     <w:p>
@@ -3377,6 +4915,276 @@
           </w:p>
         </w:tc>
       </w:tr>
+      <w:tr>
+        <w:trPr>
+          <w:cantSplit/>
+          <w:tblHeader w:val="false"/>
+        </w:trPr>
+        <w:tc>
+          <w:tcPr>
+            <w:tcW w:type="dxa" w:w="2900"/>
+            <w:tcBorders>
+              <w:top w:val="single" w:color="C9D3E6" w:sz="4"/>
+              <w:left w:val="single" w:color="C9D3E6" w:sz="4"/>
+              <w:bottom w:val="single" w:color="C9D3E6" w:sz="4"/>
+              <w:right w:val="single" w:color="C9D3E6" w:sz="4"/>
+            </w:tcBorders>
+            <w:shd w:fill="F6F8FC" w:color="auto" w:val="clear"/>
+            <w:tcMar>
+              <w:top w:type="dxa" w:w="80"/>
+              <w:left w:type="dxa" w:w="110"/>
+              <w:bottom w:type="dxa" w:w="80"/>
+              <w:right w:type="dxa" w:w="110"/>
+            </w:tcMar>
+          </w:tcPr>
+          <w:p>
+            <w:r>
+              <w:rPr>
+                <w:rFonts w:ascii="Arial" w:cs="Arial" w:eastAsia="Arial" w:hAnsi="Arial"/>
+                <w:sz w:val="20"/>
+                <w:szCs w:val="20"/>
+              </w:rPr>
+              <w:t xml:space="preserve">Vendors Hub (sellers bank with Wema)</w:t>
+            </w:r>
+          </w:p>
+        </w:tc>
+        <w:tc>
+          <w:tcPr>
+            <w:tcW w:type="dxa" w:w="3000"/>
+            <w:tcBorders>
+              <w:top w:val="single" w:color="C9D3E6" w:sz="4"/>
+              <w:left w:val="single" w:color="C9D3E6" w:sz="4"/>
+              <w:bottom w:val="single" w:color="C9D3E6" w:sz="4"/>
+              <w:right w:val="single" w:color="C9D3E6" w:sz="4"/>
+            </w:tcBorders>
+            <w:shd w:fill="F6F8FC" w:color="auto" w:val="clear"/>
+            <w:tcMar>
+              <w:top w:type="dxa" w:w="80"/>
+              <w:left w:type="dxa" w:w="110"/>
+              <w:bottom w:type="dxa" w:w="80"/>
+              <w:right w:type="dxa" w:w="110"/>
+            </w:tcMar>
+          </w:tcPr>
+          <w:p>
+            <w:r>
+              <w:rPr>
+                <w:rFonts w:ascii="Arial" w:cs="Arial" w:eastAsia="Arial" w:hAnsi="Arial"/>
+                <w:sz w:val="20"/>
+                <w:szCs w:val="20"/>
+              </w:rPr>
+              <w:t xml:space="preserve">Trusted suppliers, better prices, delivery tracked</w:t>
+            </w:r>
+          </w:p>
+        </w:tc>
+        <w:tc>
+          <w:tcPr>
+            <w:tcW w:type="dxa" w:w="3126"/>
+            <w:tcBorders>
+              <w:top w:val="single" w:color="C9D3E6" w:sz="4"/>
+              <w:left w:val="single" w:color="C9D3E6" w:sz="4"/>
+              <w:bottom w:val="single" w:color="C9D3E6" w:sz="4"/>
+              <w:right w:val="single" w:color="C9D3E6" w:sz="4"/>
+            </w:tcBorders>
+            <w:shd w:fill="F6F8FC" w:color="auto" w:val="clear"/>
+            <w:tcMar>
+              <w:top w:type="dxa" w:w="80"/>
+              <w:left w:type="dxa" w:w="110"/>
+              <w:bottom w:type="dxa" w:w="80"/>
+              <w:right w:type="dxa" w:w="110"/>
+            </w:tcMar>
+          </w:tcPr>
+          <w:p>
+            <w:r>
+              <w:rPr>
+                <w:rFonts w:ascii="Arial" w:cs="Arial" w:eastAsia="Arial" w:hAnsi="Arial"/>
+                <w:sz w:val="20"/>
+                <w:szCs w:val="20"/>
+              </w:rPr>
+              <w:t xml:space="preserve">Wholesalers become Wema customers; loans paid to verified accounts</w:t>
+            </w:r>
+          </w:p>
+        </w:tc>
+      </w:tr>
+      <w:tr>
+        <w:trPr>
+          <w:cantSplit/>
+          <w:tblHeader w:val="false"/>
+        </w:trPr>
+        <w:tc>
+          <w:tcPr>
+            <w:tcW w:type="dxa" w:w="2900"/>
+            <w:tcBorders>
+              <w:top w:val="single" w:color="C9D3E6" w:sz="4"/>
+              <w:left w:val="single" w:color="C9D3E6" w:sz="4"/>
+              <w:bottom w:val="single" w:color="C9D3E6" w:sz="4"/>
+              <w:right w:val="single" w:color="C9D3E6" w:sz="4"/>
+            </w:tcBorders>
+            <w:shd w:fill="FFFFFF" w:color="auto" w:val="clear"/>
+            <w:tcMar>
+              <w:top w:type="dxa" w:w="80"/>
+              <w:left w:type="dxa" w:w="110"/>
+              <w:bottom w:type="dxa" w:w="80"/>
+              <w:right w:type="dxa" w:w="110"/>
+            </w:tcMar>
+          </w:tcPr>
+          <w:p>
+            <w:r>
+              <w:rPr>
+                <w:rFonts w:ascii="Arial" w:cs="Arial" w:eastAsia="Arial" w:hAnsi="Arial"/>
+                <w:sz w:val="20"/>
+                <w:szCs w:val="20"/>
+              </w:rPr>
+              <w:t xml:space="preserve">CAC registration through Wema</w:t>
+            </w:r>
+          </w:p>
+        </w:tc>
+        <w:tc>
+          <w:tcPr>
+            <w:tcW w:type="dxa" w:w="3000"/>
+            <w:tcBorders>
+              <w:top w:val="single" w:color="C9D3E6" w:sz="4"/>
+              <w:left w:val="single" w:color="C9D3E6" w:sz="4"/>
+              <w:bottom w:val="single" w:color="C9D3E6" w:sz="4"/>
+              <w:right w:val="single" w:color="C9D3E6" w:sz="4"/>
+            </w:tcBorders>
+            <w:shd w:fill="FFFFFF" w:color="auto" w:val="clear"/>
+            <w:tcMar>
+              <w:top w:type="dxa" w:w="80"/>
+              <w:left w:type="dxa" w:w="110"/>
+              <w:bottom w:type="dxa" w:w="80"/>
+              <w:right w:type="dxa" w:w="110"/>
+            </w:tcMar>
+          </w:tcPr>
+          <w:p>
+            <w:r>
+              <w:rPr>
+                <w:rFonts w:ascii="Arial" w:cs="Arial" w:eastAsia="Arial" w:hAnsi="Arial"/>
+                <w:sz w:val="20"/>
+                <w:szCs w:val="20"/>
+              </w:rPr>
+              <w:t xml:space="preserve">Registered without leaving the shop</w:t>
+            </w:r>
+          </w:p>
+        </w:tc>
+        <w:tc>
+          <w:tcPr>
+            <w:tcW w:type="dxa" w:w="3126"/>
+            <w:tcBorders>
+              <w:top w:val="single" w:color="C9D3E6" w:sz="4"/>
+              <w:left w:val="single" w:color="C9D3E6" w:sz="4"/>
+              <w:bottom w:val="single" w:color="C9D3E6" w:sz="4"/>
+              <w:right w:val="single" w:color="C9D3E6" w:sz="4"/>
+            </w:tcBorders>
+            <w:shd w:fill="FFFFFF" w:color="auto" w:val="clear"/>
+            <w:tcMar>
+              <w:top w:type="dxa" w:w="80"/>
+              <w:left w:type="dxa" w:w="110"/>
+              <w:bottom w:type="dxa" w:w="80"/>
+              <w:right w:type="dxa" w:w="110"/>
+            </w:tcMar>
+          </w:tcPr>
+          <w:p>
+            <w:r>
+              <w:rPr>
+                <w:rFonts w:ascii="Arial" w:cs="Arial" w:eastAsia="Arial" w:hAnsi="Arial"/>
+                <w:sz w:val="20"/>
+                <w:szCs w:val="20"/>
+              </w:rPr>
+              <w:t xml:space="preserve">Daily savings deposits, then a registered business account</w:t>
+            </w:r>
+          </w:p>
+        </w:tc>
+      </w:tr>
+      <w:tr>
+        <w:trPr>
+          <w:cantSplit/>
+          <w:tblHeader w:val="false"/>
+        </w:trPr>
+        <w:tc>
+          <w:tcPr>
+            <w:tcW w:type="dxa" w:w="2900"/>
+            <w:tcBorders>
+              <w:top w:val="single" w:color="C9D3E6" w:sz="4"/>
+              <w:left w:val="single" w:color="C9D3E6" w:sz="4"/>
+              <w:bottom w:val="single" w:color="C9D3E6" w:sz="4"/>
+              <w:right w:val="single" w:color="C9D3E6" w:sz="4"/>
+            </w:tcBorders>
+            <w:shd w:fill="F6F8FC" w:color="auto" w:val="clear"/>
+            <w:tcMar>
+              <w:top w:type="dxa" w:w="80"/>
+              <w:left w:type="dxa" w:w="110"/>
+              <w:bottom w:type="dxa" w:w="80"/>
+              <w:right w:type="dxa" w:w="110"/>
+            </w:tcMar>
+          </w:tcPr>
+          <w:p>
+            <w:r>
+              <w:rPr>
+                <w:rFonts w:ascii="Arial" w:cs="Arial" w:eastAsia="Arial" w:hAnsi="Arial"/>
+                <w:sz w:val="20"/>
+                <w:szCs w:val="20"/>
+              </w:rPr>
+              <w:t xml:space="preserve">Evidence file and sealed records</w:t>
+            </w:r>
+          </w:p>
+        </w:tc>
+        <w:tc>
+          <w:tcPr>
+            <w:tcW w:type="dxa" w:w="3000"/>
+            <w:tcBorders>
+              <w:top w:val="single" w:color="C9D3E6" w:sz="4"/>
+              <w:left w:val="single" w:color="C9D3E6" w:sz="4"/>
+              <w:bottom w:val="single" w:color="C9D3E6" w:sz="4"/>
+              <w:right w:val="single" w:color="C9D3E6" w:sz="4"/>
+            </w:tcBorders>
+            <w:shd w:fill="F6F8FC" w:color="auto" w:val="clear"/>
+            <w:tcMar>
+              <w:top w:type="dxa" w:w="80"/>
+              <w:left w:type="dxa" w:w="110"/>
+              <w:bottom w:type="dxa" w:w="80"/>
+              <w:right w:type="dxa" w:w="110"/>
+            </w:tcMar>
+          </w:tcPr>
+          <w:p>
+            <w:r>
+              <w:rPr>
+                <w:rFonts w:ascii="Arial" w:cs="Arial" w:eastAsia="Arial" w:hAnsi="Arial"/>
+                <w:sz w:val="20"/>
+                <w:szCs w:val="20"/>
+              </w:rPr>
+              <w:t xml:space="preserve">Faster loan decisions</w:t>
+            </w:r>
+          </w:p>
+        </w:tc>
+        <w:tc>
+          <w:tcPr>
+            <w:tcW w:type="dxa" w:w="3126"/>
+            <w:tcBorders>
+              <w:top w:val="single" w:color="C9D3E6" w:sz="4"/>
+              <w:left w:val="single" w:color="C9D3E6" w:sz="4"/>
+              <w:bottom w:val="single" w:color="C9D3E6" w:sz="4"/>
+              <w:right w:val="single" w:color="C9D3E6" w:sz="4"/>
+            </w:tcBorders>
+            <w:shd w:fill="F6F8FC" w:color="auto" w:val="clear"/>
+            <w:tcMar>
+              <w:top w:type="dxa" w:w="80"/>
+              <w:left w:type="dxa" w:w="110"/>
+              <w:bottom w:type="dxa" w:w="80"/>
+              <w:right w:type="dxa" w:w="110"/>
+            </w:tcMar>
+          </w:tcPr>
+          <w:p>
+            <w:r>
+              <w:rPr>
+                <w:rFonts w:ascii="Arial" w:cs="Arial" w:eastAsia="Arial" w:hAnsi="Arial"/>
+                <w:sz w:val="20"/>
+                <w:szCs w:val="20"/>
+              </w:rPr>
+              <w:t xml:space="preserve">Score checked against raw, tamper-evident evidence</w:t>
+            </w:r>
+          </w:p>
+        </w:tc>
+      </w:tr>
     </w:tbl>
     <w:p>
       <w:pPr>
@@ -3456,7 +5264,7 @@
           <w:sz w:val="30"/>
           <w:szCs w:val="30"/>
         </w:rPr>
-        <w:t xml:space="preserve">6. Technology</w:t>
+        <w:t xml:space="preserve">7. Technology</w:t>
       </w:r>
     </w:p>
     <w:p>
@@ -3629,6 +5437,604 @@
     </w:p>
     <w:p>
       <w:pPr>
+        <w:pStyle w:val="Heading2"/>
+        <w:spacing w:after="100" w:before="200"/>
+      </w:pPr>
+      <w:r>
+        <w:rPr>
+          <w:rFonts w:ascii="Arial" w:cs="Arial" w:eastAsia="Arial" w:hAnsi="Arial"/>
+          <w:b/>
+          <w:bCs/>
+          <w:color w:val="1E5BD8"/>
+          <w:sz w:val="24"/>
+          <w:szCs w:val="24"/>
+        </w:rPr>
+        <w:t xml:space="preserve">What is built today (MVP)</w:t>
+      </w:r>
+    </w:p>
+    <w:tbl>
+      <w:tblPr>
+        <w:tblW w:type="dxa" w:w="9026"/>
+        <w:tblBorders>
+          <w:top w:val="single" w:color="auto" w:sz="4"/>
+          <w:left w:val="single" w:color="auto" w:sz="4"/>
+          <w:bottom w:val="single" w:color="auto" w:sz="4"/>
+          <w:right w:val="single" w:color="auto" w:sz="4"/>
+          <w:insideH w:val="single" w:color="auto" w:sz="4"/>
+          <w:insideV w:val="single" w:color="auto" w:sz="4"/>
+        </w:tblBorders>
+      </w:tblPr>
+      <w:tblGrid>
+        <w:gridCol w:w="3300"/>
+        <w:gridCol w:w="5726"/>
+      </w:tblGrid>
+      <w:tr>
+        <w:trPr>
+          <w:cantSplit/>
+          <w:tblHeader/>
+        </w:trPr>
+        <w:tc>
+          <w:tcPr>
+            <w:tcW w:type="dxa" w:w="3300"/>
+            <w:tcBorders>
+              <w:top w:val="single" w:color="C9D3E6" w:sz="4"/>
+              <w:left w:val="single" w:color="C9D3E6" w:sz="4"/>
+              <w:bottom w:val="single" w:color="C9D3E6" w:sz="4"/>
+              <w:right w:val="single" w:color="C9D3E6" w:sz="4"/>
+            </w:tcBorders>
+            <w:shd w:fill="0B2A6B" w:color="auto" w:val="clear"/>
+            <w:tcMar>
+              <w:top w:type="dxa" w:w="80"/>
+              <w:left w:type="dxa" w:w="110"/>
+              <w:bottom w:type="dxa" w:w="80"/>
+              <w:right w:type="dxa" w:w="110"/>
+            </w:tcMar>
+          </w:tcPr>
+          <w:p>
+            <w:r>
+              <w:rPr>
+                <w:rFonts w:ascii="Arial" w:cs="Arial" w:eastAsia="Arial" w:hAnsi="Arial"/>
+                <w:b/>
+                <w:bCs/>
+                <w:color w:val="FFFFFF"/>
+                <w:sz w:val="20"/>
+                <w:szCs w:val="20"/>
+              </w:rPr>
+              <w:t xml:space="preserve">Part</w:t>
+            </w:r>
+          </w:p>
+        </w:tc>
+        <w:tc>
+          <w:tcPr>
+            <w:tcW w:type="dxa" w:w="5726"/>
+            <w:tcBorders>
+              <w:top w:val="single" w:color="C9D3E6" w:sz="4"/>
+              <w:left w:val="single" w:color="C9D3E6" w:sz="4"/>
+              <w:bottom w:val="single" w:color="C9D3E6" w:sz="4"/>
+              <w:right w:val="single" w:color="C9D3E6" w:sz="4"/>
+            </w:tcBorders>
+            <w:shd w:fill="0B2A6B" w:color="auto" w:val="clear"/>
+            <w:tcMar>
+              <w:top w:type="dxa" w:w="80"/>
+              <w:left w:type="dxa" w:w="110"/>
+              <w:bottom w:type="dxa" w:w="80"/>
+              <w:right w:type="dxa" w:w="110"/>
+            </w:tcMar>
+          </w:tcPr>
+          <w:p>
+            <w:r>
+              <w:rPr>
+                <w:rFonts w:ascii="Arial" w:cs="Arial" w:eastAsia="Arial" w:hAnsi="Arial"/>
+                <w:b/>
+                <w:bCs/>
+                <w:color w:val="FFFFFF"/>
+                <w:sz w:val="20"/>
+                <w:szCs w:val="20"/>
+              </w:rPr>
+              <w:t xml:space="preserve">Status</w:t>
+            </w:r>
+          </w:p>
+        </w:tc>
+      </w:tr>
+      <w:tr>
+        <w:trPr>
+          <w:cantSplit/>
+          <w:tblHeader w:val="false"/>
+        </w:trPr>
+        <w:tc>
+          <w:tcPr>
+            <w:tcW w:type="dxa" w:w="3300"/>
+            <w:tcBorders>
+              <w:top w:val="single" w:color="C9D3E6" w:sz="4"/>
+              <w:left w:val="single" w:color="C9D3E6" w:sz="4"/>
+              <w:bottom w:val="single" w:color="C9D3E6" w:sz="4"/>
+              <w:right w:val="single" w:color="C9D3E6" w:sz="4"/>
+            </w:tcBorders>
+            <w:shd w:fill="FFFFFF" w:color="auto" w:val="clear"/>
+            <w:tcMar>
+              <w:top w:type="dxa" w:w="80"/>
+              <w:left w:type="dxa" w:w="110"/>
+              <w:bottom w:type="dxa" w:w="80"/>
+              <w:right w:type="dxa" w:w="110"/>
+            </w:tcMar>
+          </w:tcPr>
+          <w:p>
+            <w:r>
+              <w:rPr>
+                <w:rFonts w:ascii="Arial" w:cs="Arial" w:eastAsia="Arial" w:hAnsi="Arial"/>
+                <w:sz w:val="20"/>
+                <w:szCs w:val="20"/>
+              </w:rPr>
+              <w:t xml:space="preserve">Web app (phone, tablet, laptop)</w:t>
+            </w:r>
+          </w:p>
+        </w:tc>
+        <w:tc>
+          <w:tcPr>
+            <w:tcW w:type="dxa" w:w="5726"/>
+            <w:tcBorders>
+              <w:top w:val="single" w:color="C9D3E6" w:sz="4"/>
+              <w:left w:val="single" w:color="C9D3E6" w:sz="4"/>
+              <w:bottom w:val="single" w:color="C9D3E6" w:sz="4"/>
+              <w:right w:val="single" w:color="C9D3E6" w:sz="4"/>
+            </w:tcBorders>
+            <w:shd w:fill="FFFFFF" w:color="auto" w:val="clear"/>
+            <w:tcMar>
+              <w:top w:type="dxa" w:w="80"/>
+              <w:left w:type="dxa" w:w="110"/>
+              <w:bottom w:type="dxa" w:w="80"/>
+              <w:right w:type="dxa" w:w="110"/>
+            </w:tcMar>
+          </w:tcPr>
+          <w:p>
+            <w:r>
+              <w:rPr>
+                <w:rFonts w:ascii="Arial" w:cs="Arial" w:eastAsia="Arial" w:hAnsi="Arial"/>
+                <w:sz w:val="20"/>
+                <w:szCs w:val="20"/>
+              </w:rPr>
+              <w:t xml:space="preserve">Live at https://devemmy.github.io/VENDORA/. Installs to the home screen and works offline.</w:t>
+            </w:r>
+          </w:p>
+        </w:tc>
+      </w:tr>
+      <w:tr>
+        <w:trPr>
+          <w:cantSplit/>
+          <w:tblHeader w:val="false"/>
+        </w:trPr>
+        <w:tc>
+          <w:tcPr>
+            <w:tcW w:type="dxa" w:w="3300"/>
+            <w:tcBorders>
+              <w:top w:val="single" w:color="C9D3E6" w:sz="4"/>
+              <w:left w:val="single" w:color="C9D3E6" w:sz="4"/>
+              <w:bottom w:val="single" w:color="C9D3E6" w:sz="4"/>
+              <w:right w:val="single" w:color="C9D3E6" w:sz="4"/>
+            </w:tcBorders>
+            <w:shd w:fill="F6F8FC" w:color="auto" w:val="clear"/>
+            <w:tcMar>
+              <w:top w:type="dxa" w:w="80"/>
+              <w:left w:type="dxa" w:w="110"/>
+              <w:bottom w:type="dxa" w:w="80"/>
+              <w:right w:type="dxa" w:w="110"/>
+            </w:tcMar>
+          </w:tcPr>
+          <w:p>
+            <w:r>
+              <w:rPr>
+                <w:rFonts w:ascii="Arial" w:cs="Arial" w:eastAsia="Arial" w:hAnsi="Arial"/>
+                <w:sz w:val="20"/>
+                <w:szCs w:val="20"/>
+              </w:rPr>
+              <w:t xml:space="preserve">Voice and text assistant</w:t>
+            </w:r>
+          </w:p>
+        </w:tc>
+        <w:tc>
+          <w:tcPr>
+            <w:tcW w:type="dxa" w:w="5726"/>
+            <w:tcBorders>
+              <w:top w:val="single" w:color="C9D3E6" w:sz="4"/>
+              <w:left w:val="single" w:color="C9D3E6" w:sz="4"/>
+              <w:bottom w:val="single" w:color="C9D3E6" w:sz="4"/>
+              <w:right w:val="single" w:color="C9D3E6" w:sz="4"/>
+            </w:tcBorders>
+            <w:shd w:fill="F6F8FC" w:color="auto" w:val="clear"/>
+            <w:tcMar>
+              <w:top w:type="dxa" w:w="80"/>
+              <w:left w:type="dxa" w:w="110"/>
+              <w:bottom w:type="dxa" w:w="80"/>
+              <w:right w:type="dxa" w:w="110"/>
+            </w:tcMar>
+          </w:tcPr>
+          <w:p>
+            <w:r>
+              <w:rPr>
+                <w:rFonts w:ascii="Arial" w:cs="Arial" w:eastAsia="Arial" w:hAnsi="Arial"/>
+                <w:sz w:val="20"/>
+                <w:szCs w:val="20"/>
+              </w:rPr>
+              <w:t xml:space="preserve">Working: records sales, restocks and debt payments, answers questions, reads replies aloud. Voice works in Chrome.</w:t>
+            </w:r>
+          </w:p>
+        </w:tc>
+      </w:tr>
+      <w:tr>
+        <w:trPr>
+          <w:cantSplit/>
+          <w:tblHeader w:val="false"/>
+        </w:trPr>
+        <w:tc>
+          <w:tcPr>
+            <w:tcW w:type="dxa" w:w="3300"/>
+            <w:tcBorders>
+              <w:top w:val="single" w:color="C9D3E6" w:sz="4"/>
+              <w:left w:val="single" w:color="C9D3E6" w:sz="4"/>
+              <w:bottom w:val="single" w:color="C9D3E6" w:sz="4"/>
+              <w:right w:val="single" w:color="C9D3E6" w:sz="4"/>
+            </w:tcBorders>
+            <w:shd w:fill="FFFFFF" w:color="auto" w:val="clear"/>
+            <w:tcMar>
+              <w:top w:type="dxa" w:w="80"/>
+              <w:left w:type="dxa" w:w="110"/>
+              <w:bottom w:type="dxa" w:w="80"/>
+              <w:right w:type="dxa" w:w="110"/>
+            </w:tcMar>
+          </w:tcPr>
+          <w:p>
+            <w:r>
+              <w:rPr>
+                <w:rFonts w:ascii="Arial" w:cs="Arial" w:eastAsia="Arial" w:hAnsi="Arial"/>
+                <w:sz w:val="20"/>
+                <w:szCs w:val="20"/>
+              </w:rPr>
+              <w:t xml:space="preserve">Till, stock, debts, invoices, insights</w:t>
+            </w:r>
+          </w:p>
+        </w:tc>
+        <w:tc>
+          <w:tcPr>
+            <w:tcW w:type="dxa" w:w="5726"/>
+            <w:tcBorders>
+              <w:top w:val="single" w:color="C9D3E6" w:sz="4"/>
+              <w:left w:val="single" w:color="C9D3E6" w:sz="4"/>
+              <w:bottom w:val="single" w:color="C9D3E6" w:sz="4"/>
+              <w:right w:val="single" w:color="C9D3E6" w:sz="4"/>
+            </w:tcBorders>
+            <w:shd w:fill="FFFFFF" w:color="auto" w:val="clear"/>
+            <w:tcMar>
+              <w:top w:type="dxa" w:w="80"/>
+              <w:left w:type="dxa" w:w="110"/>
+              <w:bottom w:type="dxa" w:w="80"/>
+              <w:right w:type="dxa" w:w="110"/>
+            </w:tcMar>
+          </w:tcPr>
+          <w:p>
+            <w:r>
+              <w:rPr>
+                <w:rFonts w:ascii="Arial" w:cs="Arial" w:eastAsia="Arial" w:hAnsi="Arial"/>
+                <w:sz w:val="20"/>
+                <w:szCs w:val="20"/>
+              </w:rPr>
+              <w:t xml:space="preserve">Working.</w:t>
+            </w:r>
+          </w:p>
+        </w:tc>
+      </w:tr>
+      <w:tr>
+        <w:trPr>
+          <w:cantSplit/>
+          <w:tblHeader w:val="false"/>
+        </w:trPr>
+        <w:tc>
+          <w:tcPr>
+            <w:tcW w:type="dxa" w:w="3300"/>
+            <w:tcBorders>
+              <w:top w:val="single" w:color="C9D3E6" w:sz="4"/>
+              <w:left w:val="single" w:color="C9D3E6" w:sz="4"/>
+              <w:bottom w:val="single" w:color="C9D3E6" w:sz="4"/>
+              <w:right w:val="single" w:color="C9D3E6" w:sz="4"/>
+            </w:tcBorders>
+            <w:shd w:fill="F6F8FC" w:color="auto" w:val="clear"/>
+            <w:tcMar>
+              <w:top w:type="dxa" w:w="80"/>
+              <w:left w:type="dxa" w:w="110"/>
+              <w:bottom w:type="dxa" w:w="80"/>
+              <w:right w:type="dxa" w:w="110"/>
+            </w:tcMar>
+          </w:tcPr>
+          <w:p>
+            <w:r>
+              <w:rPr>
+                <w:rFonts w:ascii="Arial" w:cs="Arial" w:eastAsia="Arial" w:hAnsi="Arial"/>
+                <w:sz w:val="20"/>
+                <w:szCs w:val="20"/>
+              </w:rPr>
+              <w:t xml:space="preserve">Receipt check</w:t>
+            </w:r>
+          </w:p>
+        </w:tc>
+        <w:tc>
+          <w:tcPr>
+            <w:tcW w:type="dxa" w:w="5726"/>
+            <w:tcBorders>
+              <w:top w:val="single" w:color="C9D3E6" w:sz="4"/>
+              <w:left w:val="single" w:color="C9D3E6" w:sz="4"/>
+              <w:bottom w:val="single" w:color="C9D3E6" w:sz="4"/>
+              <w:right w:val="single" w:color="C9D3E6" w:sz="4"/>
+            </w:tcBorders>
+            <w:shd w:fill="F6F8FC" w:color="auto" w:val="clear"/>
+            <w:tcMar>
+              <w:top w:type="dxa" w:w="80"/>
+              <w:left w:type="dxa" w:w="110"/>
+              <w:bottom w:type="dxa" w:w="80"/>
+              <w:right w:type="dxa" w:w="110"/>
+            </w:tcMar>
+          </w:tcPr>
+          <w:p>
+            <w:r>
+              <w:rPr>
+                <w:rFonts w:ascii="Arial" w:cs="Arial" w:eastAsia="Arial" w:hAnsi="Arial"/>
+                <w:sz w:val="20"/>
+                <w:szCs w:val="20"/>
+              </w:rPr>
+              <w:t xml:space="preserve">Working: reads receipts on the phone (OCR) or by typing, then checks with the simulated Wema account.</w:t>
+            </w:r>
+          </w:p>
+        </w:tc>
+      </w:tr>
+      <w:tr>
+        <w:trPr>
+          <w:cantSplit/>
+          <w:tblHeader w:val="false"/>
+        </w:trPr>
+        <w:tc>
+          <w:tcPr>
+            <w:tcW w:type="dxa" w:w="3300"/>
+            <w:tcBorders>
+              <w:top w:val="single" w:color="C9D3E6" w:sz="4"/>
+              <w:left w:val="single" w:color="C9D3E6" w:sz="4"/>
+              <w:bottom w:val="single" w:color="C9D3E6" w:sz="4"/>
+              <w:right w:val="single" w:color="C9D3E6" w:sz="4"/>
+            </w:tcBorders>
+            <w:shd w:fill="FFFFFF" w:color="auto" w:val="clear"/>
+            <w:tcMar>
+              <w:top w:type="dxa" w:w="80"/>
+              <w:left w:type="dxa" w:w="110"/>
+              <w:bottom w:type="dxa" w:w="80"/>
+              <w:right w:type="dxa" w:w="110"/>
+            </w:tcMar>
+          </w:tcPr>
+          <w:p>
+            <w:r>
+              <w:rPr>
+                <w:rFonts w:ascii="Arial" w:cs="Arial" w:eastAsia="Arial" w:hAnsi="Arial"/>
+                <w:sz w:val="20"/>
+                <w:szCs w:val="20"/>
+              </w:rPr>
+              <w:t xml:space="preserve">Vendors Hub and adverts</w:t>
+            </w:r>
+          </w:p>
+        </w:tc>
+        <w:tc>
+          <w:tcPr>
+            <w:tcW w:type="dxa" w:w="5726"/>
+            <w:tcBorders>
+              <w:top w:val="single" w:color="C9D3E6" w:sz="4"/>
+              <w:left w:val="single" w:color="C9D3E6" w:sz="4"/>
+              <w:bottom w:val="single" w:color="C9D3E6" w:sz="4"/>
+              <w:right w:val="single" w:color="C9D3E6" w:sz="4"/>
+            </w:tcBorders>
+            <w:shd w:fill="FFFFFF" w:color="auto" w:val="clear"/>
+            <w:tcMar>
+              <w:top w:type="dxa" w:w="80"/>
+              <w:left w:type="dxa" w:w="110"/>
+              <w:bottom w:type="dxa" w:w="80"/>
+              <w:right w:type="dxa" w:w="110"/>
+            </w:tcMar>
+          </w:tcPr>
+          <w:p>
+            <w:r>
+              <w:rPr>
+                <w:rFonts w:ascii="Arial" w:cs="Arial" w:eastAsia="Arial" w:hAnsi="Arial"/>
+                <w:sz w:val="20"/>
+                <w:szCs w:val="20"/>
+              </w:rPr>
+              <w:t xml:space="preserve">Working with sample verified sellers; adverts with photos and video are stored on the phone.</w:t>
+            </w:r>
+          </w:p>
+        </w:tc>
+      </w:tr>
+      <w:tr>
+        <w:trPr>
+          <w:cantSplit/>
+          <w:tblHeader w:val="false"/>
+        </w:trPr>
+        <w:tc>
+          <w:tcPr>
+            <w:tcW w:type="dxa" w:w="3300"/>
+            <w:tcBorders>
+              <w:top w:val="single" w:color="C9D3E6" w:sz="4"/>
+              <w:left w:val="single" w:color="C9D3E6" w:sz="4"/>
+              <w:bottom w:val="single" w:color="C9D3E6" w:sz="4"/>
+              <w:right w:val="single" w:color="C9D3E6" w:sz="4"/>
+            </w:tcBorders>
+            <w:shd w:fill="F6F8FC" w:color="auto" w:val="clear"/>
+            <w:tcMar>
+              <w:top w:type="dxa" w:w="80"/>
+              <w:left w:type="dxa" w:w="110"/>
+              <w:bottom w:type="dxa" w:w="80"/>
+              <w:right w:type="dxa" w:w="110"/>
+            </w:tcMar>
+          </w:tcPr>
+          <w:p>
+            <w:r>
+              <w:rPr>
+                <w:rFonts w:ascii="Arial" w:cs="Arial" w:eastAsia="Arial" w:hAnsi="Arial"/>
+                <w:sz w:val="20"/>
+                <w:szCs w:val="20"/>
+              </w:rPr>
+              <w:t xml:space="preserve">Wema services (accounts, transfers, loans, CAC filing)</w:t>
+            </w:r>
+          </w:p>
+        </w:tc>
+        <w:tc>
+          <w:tcPr>
+            <w:tcW w:type="dxa" w:w="5726"/>
+            <w:tcBorders>
+              <w:top w:val="single" w:color="C9D3E6" w:sz="4"/>
+              <w:left w:val="single" w:color="C9D3E6" w:sz="4"/>
+              <w:bottom w:val="single" w:color="C9D3E6" w:sz="4"/>
+              <w:right w:val="single" w:color="C9D3E6" w:sz="4"/>
+            </w:tcBorders>
+            <w:shd w:fill="F6F8FC" w:color="auto" w:val="clear"/>
+            <w:tcMar>
+              <w:top w:type="dxa" w:w="80"/>
+              <w:left w:type="dxa" w:w="110"/>
+              <w:bottom w:type="dxa" w:w="80"/>
+              <w:right w:type="dxa" w:w="110"/>
+            </w:tcMar>
+          </w:tcPr>
+          <w:p>
+            <w:r>
+              <w:rPr>
+                <w:rFonts w:ascii="Arial" w:cs="Arial" w:eastAsia="Arial" w:hAnsi="Arial"/>
+                <w:sz w:val="20"/>
+                <w:szCs w:val="20"/>
+              </w:rPr>
+              <w:t xml:space="preserve">Simulated in the app and on our server, ready to be replaced with Wema's real APIs.</w:t>
+            </w:r>
+          </w:p>
+        </w:tc>
+      </w:tr>
+      <w:tr>
+        <w:trPr>
+          <w:cantSplit/>
+          <w:tblHeader w:val="false"/>
+        </w:trPr>
+        <w:tc>
+          <w:tcPr>
+            <w:tcW w:type="dxa" w:w="3300"/>
+            <w:tcBorders>
+              <w:top w:val="single" w:color="C9D3E6" w:sz="4"/>
+              <w:left w:val="single" w:color="C9D3E6" w:sz="4"/>
+              <w:bottom w:val="single" w:color="C9D3E6" w:sz="4"/>
+              <w:right w:val="single" w:color="C9D3E6" w:sz="4"/>
+            </w:tcBorders>
+            <w:shd w:fill="FFFFFF" w:color="auto" w:val="clear"/>
+            <w:tcMar>
+              <w:top w:type="dxa" w:w="80"/>
+              <w:left w:type="dxa" w:w="110"/>
+              <w:bottom w:type="dxa" w:w="80"/>
+              <w:right w:type="dxa" w:w="110"/>
+            </w:tcMar>
+          </w:tcPr>
+          <w:p>
+            <w:r>
+              <w:rPr>
+                <w:rFonts w:ascii="Arial" w:cs="Arial" w:eastAsia="Arial" w:hAnsi="Arial"/>
+                <w:sz w:val="20"/>
+                <w:szCs w:val="20"/>
+              </w:rPr>
+              <w:t xml:space="preserve">Sealed records and evidence file</w:t>
+            </w:r>
+          </w:p>
+        </w:tc>
+        <w:tc>
+          <w:tcPr>
+            <w:tcW w:type="dxa" w:w="5726"/>
+            <w:tcBorders>
+              <w:top w:val="single" w:color="C9D3E6" w:sz="4"/>
+              <w:left w:val="single" w:color="C9D3E6" w:sz="4"/>
+              <w:bottom w:val="single" w:color="C9D3E6" w:sz="4"/>
+              <w:right w:val="single" w:color="C9D3E6" w:sz="4"/>
+            </w:tcBorders>
+            <w:shd w:fill="FFFFFF" w:color="auto" w:val="clear"/>
+            <w:tcMar>
+              <w:top w:type="dxa" w:w="80"/>
+              <w:left w:type="dxa" w:w="110"/>
+              <w:bottom w:type="dxa" w:w="80"/>
+              <w:right w:type="dxa" w:w="110"/>
+            </w:tcMar>
+          </w:tcPr>
+          <w:p>
+            <w:r>
+              <w:rPr>
+                <w:rFonts w:ascii="Arial" w:cs="Arial" w:eastAsia="Arial" w:hAnsi="Arial"/>
+                <w:sz w:val="20"/>
+                <w:szCs w:val="20"/>
+              </w:rPr>
+              <w:t xml:space="preserve">Working, including tamper detection and the Excel export.</w:t>
+            </w:r>
+          </w:p>
+        </w:tc>
+      </w:tr>
+      <w:tr>
+        <w:trPr>
+          <w:cantSplit/>
+          <w:tblHeader w:val="false"/>
+        </w:trPr>
+        <w:tc>
+          <w:tcPr>
+            <w:tcW w:type="dxa" w:w="3300"/>
+            <w:tcBorders>
+              <w:top w:val="single" w:color="C9D3E6" w:sz="4"/>
+              <w:left w:val="single" w:color="C9D3E6" w:sz="4"/>
+              <w:bottom w:val="single" w:color="C9D3E6" w:sz="4"/>
+              <w:right w:val="single" w:color="C9D3E6" w:sz="4"/>
+            </w:tcBorders>
+            <w:shd w:fill="F6F8FC" w:color="auto" w:val="clear"/>
+            <w:tcMar>
+              <w:top w:type="dxa" w:w="80"/>
+              <w:left w:type="dxa" w:w="110"/>
+              <w:bottom w:type="dxa" w:w="80"/>
+              <w:right w:type="dxa" w:w="110"/>
+            </w:tcMar>
+          </w:tcPr>
+          <w:p>
+            <w:r>
+              <w:rPr>
+                <w:rFonts w:ascii="Arial" w:cs="Arial" w:eastAsia="Arial" w:hAnsi="Arial"/>
+                <w:sz w:val="20"/>
+                <w:szCs w:val="20"/>
+              </w:rPr>
+              <w:t xml:space="preserve">Server (WhatsApp, sync, submissions)</w:t>
+            </w:r>
+          </w:p>
+        </w:tc>
+        <w:tc>
+          <w:tcPr>
+            <w:tcW w:type="dxa" w:w="5726"/>
+            <w:tcBorders>
+              <w:top w:val="single" w:color="C9D3E6" w:sz="4"/>
+              <w:left w:val="single" w:color="C9D3E6" w:sz="4"/>
+              <w:bottom w:val="single" w:color="C9D3E6" w:sz="4"/>
+              <w:right w:val="single" w:color="C9D3E6" w:sz="4"/>
+            </w:tcBorders>
+            <w:shd w:fill="F6F8FC" w:color="auto" w:val="clear"/>
+            <w:tcMar>
+              <w:top w:type="dxa" w:w="80"/>
+              <w:left w:type="dxa" w:w="110"/>
+              <w:bottom w:type="dxa" w:w="80"/>
+              <w:right w:type="dxa" w:w="110"/>
+            </w:tcMar>
+          </w:tcPr>
+          <w:p>
+            <w:r>
+              <w:rPr>
+                <w:rFonts w:ascii="Arial" w:cs="Arial" w:eastAsia="Arial" w:hAnsi="Arial"/>
+                <w:sz w:val="20"/>
+                <w:szCs w:val="20"/>
+              </w:rPr>
+              <w:t xml:space="preserve">Built and tested (24 automated tests); WhatsApp needs Meta credentials to go live.</w:t>
+            </w:r>
+          </w:p>
+        </w:tc>
+      </w:tr>
+    </w:tbl>
+    <w:p>
+      <w:pPr>
         <w:pStyle w:val="Heading1"/>
         <w:pBdr>
           <w:bottom w:val="single" w:color="F5B800" w:sz="8" w:space="4"/>
@@ -3644,7 +6050,7 @@
           <w:sz w:val="30"/>
           <w:szCs w:val="30"/>
         </w:rPr>
-        <w:t xml:space="preserve">7. Business model</w:t>
+        <w:t xml:space="preserve">8. Business model</w:t>
       </w:r>
     </w:p>
     <w:p>
@@ -4122,7 +6528,7 @@
           <w:sz w:val="24"/>
           <w:szCs w:val="24"/>
         </w:rPr>
-        <w:t xml:space="preserve">Three revenue streams</w:t>
+        <w:t xml:space="preserve">Four revenue streams</w:t>
       </w:r>
     </w:p>
     <w:p>
@@ -4130,7 +6536,7 @@
         <w:pStyle w:val="ListParagraph"/>
         <w:numPr>
           <w:ilvl w:val="0"/>
-          <w:numId w:val="4"/>
+          <w:numId w:val="5"/>
         </w:numPr>
         <w:spacing w:after="80" w:line="290"/>
       </w:pPr>
@@ -4158,7 +6564,7 @@
         <w:pStyle w:val="ListParagraph"/>
         <w:numPr>
           <w:ilvl w:val="0"/>
-          <w:numId w:val="4"/>
+          <w:numId w:val="5"/>
         </w:numPr>
         <w:spacing w:after="80" w:line="290"/>
       </w:pPr>
@@ -4186,7 +6592,7 @@
         <w:pStyle w:val="ListParagraph"/>
         <w:numPr>
           <w:ilvl w:val="0"/>
-          <w:numId w:val="4"/>
+          <w:numId w:val="5"/>
         </w:numPr>
         <w:spacing w:after="80" w:line="290"/>
       </w:pPr>
@@ -4207,6 +6613,34 @@
           <w:szCs w:val="22"/>
         </w:rPr>
         <w:t xml:space="preserve"> by Wema as a customer-acquisition channel.</w:t>
+      </w:r>
+    </w:p>
+    <w:p>
+      <w:pPr>
+        <w:pStyle w:val="ListParagraph"/>
+        <w:numPr>
+          <w:ilvl w:val="0"/>
+          <w:numId w:val="5"/>
+        </w:numPr>
+        <w:spacing w:after="80" w:line="290"/>
+      </w:pPr>
+      <w:r>
+        <w:rPr>
+          <w:rFonts w:ascii="Arial" w:cs="Arial" w:eastAsia="Arial" w:hAnsi="Arial"/>
+          <w:b/>
+          <w:bCs/>
+          <w:sz w:val="22"/>
+          <w:szCs w:val="22"/>
+        </w:rPr>
+        <w:t xml:space="preserve">Vendors Hub:</w:t>
+      </w:r>
+      <w:r>
+        <w:rPr>
+          <w:rFonts w:ascii="Arial" w:cs="Arial" w:eastAsia="Arial" w:hAnsi="Arial"/>
+          <w:sz w:val="22"/>
+          <w:szCs w:val="22"/>
+        </w:rPr>
+        <w:t xml:space="preserve"> featured adverts for sellers and a small fee on orders, shared with Wema where orders are paid with Wema loans.</w:t>
       </w:r>
     </w:p>
     <w:p>
@@ -4274,7 +6708,7 @@
           <w:sz w:val="30"/>
           <w:szCs w:val="30"/>
         </w:rPr>
-        <w:t xml:space="preserve">8. Expected impact</w:t>
+        <w:t xml:space="preserve">9. Expected impact</w:t>
       </w:r>
     </w:p>
     <w:tbl>
@@ -4602,7 +7036,7 @@
                 <w:sz w:val="20"/>
                 <w:szCs w:val="20"/>
               </w:rPr>
-              <w:t xml:space="preserve">Staff</w:t>
+              <w:t xml:space="preserve">Suppliers</w:t>
             </w:r>
           </w:p>
         </w:tc>
@@ -4630,7 +7064,7 @@
                 <w:sz w:val="20"/>
                 <w:szCs w:val="20"/>
               </w:rPr>
-              <w:t xml:space="preserve">Missing money, no way to know who sold what</w:t>
+              <w:t xml:space="preserve">Unknown wholesalers, goods paid for but not delivered</w:t>
             </w:r>
           </w:p>
         </w:tc>
@@ -4658,7 +7092,7 @@
                 <w:sz w:val="20"/>
                 <w:szCs w:val="20"/>
               </w:rPr>
-              <w:t xml:space="preserve">Each assistant's sales tracked separately</w:t>
+              <w:t xml:space="preserve">Verified sellers, price comparison, delivery confirmed</w:t>
             </w:r>
           </w:p>
         </w:tc>
@@ -4692,7 +7126,7 @@
                 <w:sz w:val="20"/>
                 <w:szCs w:val="20"/>
               </w:rPr>
-              <w:t xml:space="preserve">Stock</w:t>
+              <w:t xml:space="preserve">Formal business</w:t>
             </w:r>
           </w:p>
         </w:tc>
@@ -4720,7 +7154,7 @@
                 <w:sz w:val="20"/>
                 <w:szCs w:val="20"/>
               </w:rPr>
-              <w:t xml:space="preserve">Running out without warning</w:t>
+              <w:t xml:space="preserve">Unregistered, invisible to big buyers</w:t>
             </w:r>
           </w:p>
         </w:tc>
@@ -4748,7 +7182,7 @@
                 <w:sz w:val="20"/>
                 <w:szCs w:val="20"/>
               </w:rPr>
-              <w:t xml:space="preserve">Early warnings and restock suggestions</w:t>
+              <w:t xml:space="preserve">CAC registration saved for daily and filed by Wema</w:t>
             </w:r>
           </w:p>
         </w:tc>
@@ -4782,7 +7216,7 @@
                 <w:sz w:val="20"/>
                 <w:szCs w:val="20"/>
               </w:rPr>
-              <w:t xml:space="preserve">Finance</w:t>
+              <w:t xml:space="preserve">Staff</w:t>
             </w:r>
           </w:p>
         </w:tc>
@@ -4810,7 +7244,7 @@
                 <w:sz w:val="20"/>
                 <w:szCs w:val="20"/>
               </w:rPr>
-              <w:t xml:space="preserve">No records, no bank loans</w:t>
+              <w:t xml:space="preserve">Missing money, no way to know who sold what</w:t>
             </w:r>
           </w:p>
         </w:tc>
@@ -4838,7 +7272,7 @@
                 <w:sz w:val="20"/>
                 <w:szCs w:val="20"/>
               </w:rPr>
-              <w:t xml:space="preserve">Business Score unlocks Wema restock loans</w:t>
+              <w:t xml:space="preserve">Each assistant's sales tracked separately</w:t>
             </w:r>
           </w:p>
         </w:tc>
@@ -4872,6 +7306,186 @@
                 <w:sz w:val="20"/>
                 <w:szCs w:val="20"/>
               </w:rPr>
+              <w:t xml:space="preserve">Stock</w:t>
+            </w:r>
+          </w:p>
+        </w:tc>
+        <w:tc>
+          <w:tcPr>
+            <w:tcW w:type="dxa" w:w="3500"/>
+            <w:tcBorders>
+              <w:top w:val="single" w:color="C9D3E6" w:sz="4"/>
+              <w:left w:val="single" w:color="C9D3E6" w:sz="4"/>
+              <w:bottom w:val="single" w:color="C9D3E6" w:sz="4"/>
+              <w:right w:val="single" w:color="C9D3E6" w:sz="4"/>
+            </w:tcBorders>
+            <w:shd w:fill="F6F8FC" w:color="auto" w:val="clear"/>
+            <w:tcMar>
+              <w:top w:type="dxa" w:w="80"/>
+              <w:left w:type="dxa" w:w="110"/>
+              <w:bottom w:type="dxa" w:w="80"/>
+              <w:right w:type="dxa" w:w="110"/>
+            </w:tcMar>
+          </w:tcPr>
+          <w:p>
+            <w:r>
+              <w:rPr>
+                <w:rFonts w:ascii="Arial" w:cs="Arial" w:eastAsia="Arial" w:hAnsi="Arial"/>
+                <w:sz w:val="20"/>
+                <w:szCs w:val="20"/>
+              </w:rPr>
+              <w:t xml:space="preserve">Running out without warning</w:t>
+            </w:r>
+          </w:p>
+        </w:tc>
+        <w:tc>
+          <w:tcPr>
+            <w:tcW w:type="dxa" w:w="3626"/>
+            <w:tcBorders>
+              <w:top w:val="single" w:color="C9D3E6" w:sz="4"/>
+              <w:left w:val="single" w:color="C9D3E6" w:sz="4"/>
+              <w:bottom w:val="single" w:color="C9D3E6" w:sz="4"/>
+              <w:right w:val="single" w:color="C9D3E6" w:sz="4"/>
+            </w:tcBorders>
+            <w:shd w:fill="F6F8FC" w:color="auto" w:val="clear"/>
+            <w:tcMar>
+              <w:top w:type="dxa" w:w="80"/>
+              <w:left w:type="dxa" w:w="110"/>
+              <w:bottom w:type="dxa" w:w="80"/>
+              <w:right w:type="dxa" w:w="110"/>
+            </w:tcMar>
+          </w:tcPr>
+          <w:p>
+            <w:r>
+              <w:rPr>
+                <w:rFonts w:ascii="Arial" w:cs="Arial" w:eastAsia="Arial" w:hAnsi="Arial"/>
+                <w:sz w:val="20"/>
+                <w:szCs w:val="20"/>
+              </w:rPr>
+              <w:t xml:space="preserve">Early warnings and restock suggestions</w:t>
+            </w:r>
+          </w:p>
+        </w:tc>
+      </w:tr>
+      <w:tr>
+        <w:trPr>
+          <w:cantSplit/>
+          <w:tblHeader w:val="false"/>
+        </w:trPr>
+        <w:tc>
+          <w:tcPr>
+            <w:tcW w:type="dxa" w:w="1900"/>
+            <w:tcBorders>
+              <w:top w:val="single" w:color="C9D3E6" w:sz="4"/>
+              <w:left w:val="single" w:color="C9D3E6" w:sz="4"/>
+              <w:bottom w:val="single" w:color="C9D3E6" w:sz="4"/>
+              <w:right w:val="single" w:color="C9D3E6" w:sz="4"/>
+            </w:tcBorders>
+            <w:shd w:fill="FFFFFF" w:color="auto" w:val="clear"/>
+            <w:tcMar>
+              <w:top w:type="dxa" w:w="80"/>
+              <w:left w:type="dxa" w:w="110"/>
+              <w:bottom w:type="dxa" w:w="80"/>
+              <w:right w:type="dxa" w:w="110"/>
+            </w:tcMar>
+          </w:tcPr>
+          <w:p>
+            <w:r>
+              <w:rPr>
+                <w:rFonts w:ascii="Arial" w:cs="Arial" w:eastAsia="Arial" w:hAnsi="Arial"/>
+                <w:sz w:val="20"/>
+                <w:szCs w:val="20"/>
+              </w:rPr>
+              <w:t xml:space="preserve">Finance</w:t>
+            </w:r>
+          </w:p>
+        </w:tc>
+        <w:tc>
+          <w:tcPr>
+            <w:tcW w:type="dxa" w:w="3500"/>
+            <w:tcBorders>
+              <w:top w:val="single" w:color="C9D3E6" w:sz="4"/>
+              <w:left w:val="single" w:color="C9D3E6" w:sz="4"/>
+              <w:bottom w:val="single" w:color="C9D3E6" w:sz="4"/>
+              <w:right w:val="single" w:color="C9D3E6" w:sz="4"/>
+            </w:tcBorders>
+            <w:shd w:fill="FFFFFF" w:color="auto" w:val="clear"/>
+            <w:tcMar>
+              <w:top w:type="dxa" w:w="80"/>
+              <w:left w:type="dxa" w:w="110"/>
+              <w:bottom w:type="dxa" w:w="80"/>
+              <w:right w:type="dxa" w:w="110"/>
+            </w:tcMar>
+          </w:tcPr>
+          <w:p>
+            <w:r>
+              <w:rPr>
+                <w:rFonts w:ascii="Arial" w:cs="Arial" w:eastAsia="Arial" w:hAnsi="Arial"/>
+                <w:sz w:val="20"/>
+                <w:szCs w:val="20"/>
+              </w:rPr>
+              <w:t xml:space="preserve">No records, no bank loans</w:t>
+            </w:r>
+          </w:p>
+        </w:tc>
+        <w:tc>
+          <w:tcPr>
+            <w:tcW w:type="dxa" w:w="3626"/>
+            <w:tcBorders>
+              <w:top w:val="single" w:color="C9D3E6" w:sz="4"/>
+              <w:left w:val="single" w:color="C9D3E6" w:sz="4"/>
+              <w:bottom w:val="single" w:color="C9D3E6" w:sz="4"/>
+              <w:right w:val="single" w:color="C9D3E6" w:sz="4"/>
+            </w:tcBorders>
+            <w:shd w:fill="FFFFFF" w:color="auto" w:val="clear"/>
+            <w:tcMar>
+              <w:top w:type="dxa" w:w="80"/>
+              <w:left w:type="dxa" w:w="110"/>
+              <w:bottom w:type="dxa" w:w="80"/>
+              <w:right w:type="dxa" w:w="110"/>
+            </w:tcMar>
+          </w:tcPr>
+          <w:p>
+            <w:r>
+              <w:rPr>
+                <w:rFonts w:ascii="Arial" w:cs="Arial" w:eastAsia="Arial" w:hAnsi="Arial"/>
+                <w:sz w:val="20"/>
+                <w:szCs w:val="20"/>
+              </w:rPr>
+              <w:t xml:space="preserve">Business Score unlocks Wema restock loans</w:t>
+            </w:r>
+          </w:p>
+        </w:tc>
+      </w:tr>
+      <w:tr>
+        <w:trPr>
+          <w:cantSplit/>
+          <w:tblHeader w:val="false"/>
+        </w:trPr>
+        <w:tc>
+          <w:tcPr>
+            <w:tcW w:type="dxa" w:w="1900"/>
+            <w:tcBorders>
+              <w:top w:val="single" w:color="C9D3E6" w:sz="4"/>
+              <w:left w:val="single" w:color="C9D3E6" w:sz="4"/>
+              <w:bottom w:val="single" w:color="C9D3E6" w:sz="4"/>
+              <w:right w:val="single" w:color="C9D3E6" w:sz="4"/>
+            </w:tcBorders>
+            <w:shd w:fill="F6F8FC" w:color="auto" w:val="clear"/>
+            <w:tcMar>
+              <w:top w:type="dxa" w:w="80"/>
+              <w:left w:type="dxa" w:w="110"/>
+              <w:bottom w:type="dxa" w:w="80"/>
+              <w:right w:type="dxa" w:w="110"/>
+            </w:tcMar>
+          </w:tcPr>
+          <w:p>
+            <w:r>
+              <w:rPr>
+                <w:rFonts w:ascii="Arial" w:cs="Arial" w:eastAsia="Arial" w:hAnsi="Arial"/>
+                <w:sz w:val="20"/>
+                <w:szCs w:val="20"/>
+              </w:rPr>
               <w:t xml:space="preserve">Savings</w:t>
             </w:r>
           </w:p>
@@ -4951,7 +7565,7 @@
           <w:sz w:val="30"/>
           <w:szCs w:val="30"/>
         </w:rPr>
-        <w:t xml:space="preserve">9. Pilot and rollout plan</w:t>
+        <w:t xml:space="preserve">10. Pilot and rollout plan</w:t>
       </w:r>
     </w:p>
     <w:tbl>
@@ -5448,7 +8062,7 @@
           <w:sz w:val="30"/>
           <w:szCs w:val="30"/>
         </w:rPr>
-        <w:t xml:space="preserve">10. Risks and how we will handle them</w:t>
+        <w:t xml:space="preserve">11. Risks and how we will handle them</w:t>
       </w:r>
     </w:p>
     <w:tbl>
@@ -5907,6 +8521,192 @@
           </w:p>
         </w:tc>
       </w:tr>
+      <w:tr>
+        <w:trPr>
+          <w:cantSplit/>
+          <w:tblHeader w:val="false"/>
+        </w:trPr>
+        <w:tc>
+          <w:tcPr>
+            <w:tcW w:type="dxa" w:w="3000"/>
+            <w:tcBorders>
+              <w:top w:val="single" w:color="C9D3E6" w:sz="4"/>
+              <w:left w:val="single" w:color="C9D3E6" w:sz="4"/>
+              <w:bottom w:val="single" w:color="C9D3E6" w:sz="4"/>
+              <w:right w:val="single" w:color="C9D3E6" w:sz="4"/>
+            </w:tcBorders>
+            <w:shd w:fill="FFFFFF" w:color="auto" w:val="clear"/>
+            <w:tcMar>
+              <w:top w:type="dxa" w:w="80"/>
+              <w:left w:type="dxa" w:w="110"/>
+              <w:bottom w:type="dxa" w:w="80"/>
+              <w:right w:type="dxa" w:w="110"/>
+            </w:tcMar>
+          </w:tcPr>
+          <w:p>
+            <w:r>
+              <w:rPr>
+                <w:rFonts w:ascii="Arial" w:cs="Arial" w:eastAsia="Arial" w:hAnsi="Arial"/>
+                <w:sz w:val="20"/>
+                <w:szCs w:val="20"/>
+              </w:rPr>
+              <w:t xml:space="preserve">Traders inflate sales to get bigger loans</w:t>
+            </w:r>
+          </w:p>
+        </w:tc>
+        <w:tc>
+          <w:tcPr>
+            <w:tcW w:type="dxa" w:w="6026"/>
+            <w:tcBorders>
+              <w:top w:val="single" w:color="C9D3E6" w:sz="4"/>
+              <w:left w:val="single" w:color="C9D3E6" w:sz="4"/>
+              <w:bottom w:val="single" w:color="C9D3E6" w:sz="4"/>
+              <w:right w:val="single" w:color="C9D3E6" w:sz="4"/>
+            </w:tcBorders>
+            <w:shd w:fill="FFFFFF" w:color="auto" w:val="clear"/>
+            <w:tcMar>
+              <w:top w:type="dxa" w:w="80"/>
+              <w:left w:type="dxa" w:w="110"/>
+              <w:bottom w:type="dxa" w:w="80"/>
+              <w:right w:type="dxa" w:w="110"/>
+            </w:tcMar>
+          </w:tcPr>
+          <w:p>
+            <w:r>
+              <w:rPr>
+                <w:rFonts w:ascii="Arial" w:cs="Arial" w:eastAsia="Arial" w:hAnsi="Arial"/>
+                <w:sz w:val="20"/>
+                <w:szCs w:val="20"/>
+              </w:rPr>
+              <w:t xml:space="preserve">Sealed, signed records; proof level on every sale; only bank-, receipt- or delivery-confirmed money raises the score; evidence file for Wema to check.</w:t>
+            </w:r>
+          </w:p>
+        </w:tc>
+      </w:tr>
+      <w:tr>
+        <w:trPr>
+          <w:cantSplit/>
+          <w:tblHeader w:val="false"/>
+        </w:trPr>
+        <w:tc>
+          <w:tcPr>
+            <w:tcW w:type="dxa" w:w="3000"/>
+            <w:tcBorders>
+              <w:top w:val="single" w:color="C9D3E6" w:sz="4"/>
+              <w:left w:val="single" w:color="C9D3E6" w:sz="4"/>
+              <w:bottom w:val="single" w:color="C9D3E6" w:sz="4"/>
+              <w:right w:val="single" w:color="C9D3E6" w:sz="4"/>
+            </w:tcBorders>
+            <w:shd w:fill="F6F8FC" w:color="auto" w:val="clear"/>
+            <w:tcMar>
+              <w:top w:type="dxa" w:w="80"/>
+              <w:left w:type="dxa" w:w="110"/>
+              <w:bottom w:type="dxa" w:w="80"/>
+              <w:right w:type="dxa" w:w="110"/>
+            </w:tcMar>
+          </w:tcPr>
+          <w:p>
+            <w:r>
+              <w:rPr>
+                <w:rFonts w:ascii="Arial" w:cs="Arial" w:eastAsia="Arial" w:hAnsi="Arial"/>
+                <w:sz w:val="20"/>
+                <w:szCs w:val="20"/>
+              </w:rPr>
+              <w:t xml:space="preserve">Fake or unreliable sellers on the Hub</w:t>
+            </w:r>
+          </w:p>
+        </w:tc>
+        <w:tc>
+          <w:tcPr>
+            <w:tcW w:type="dxa" w:w="6026"/>
+            <w:tcBorders>
+              <w:top w:val="single" w:color="C9D3E6" w:sz="4"/>
+              <w:left w:val="single" w:color="C9D3E6" w:sz="4"/>
+              <w:bottom w:val="single" w:color="C9D3E6" w:sz="4"/>
+              <w:right w:val="single" w:color="C9D3E6" w:sz="4"/>
+            </w:tcBorders>
+            <w:shd w:fill="F6F8FC" w:color="auto" w:val="clear"/>
+            <w:tcMar>
+              <w:top w:type="dxa" w:w="80"/>
+              <w:left w:type="dxa" w:w="110"/>
+              <w:bottom w:type="dxa" w:w="80"/>
+              <w:right w:type="dxa" w:w="110"/>
+            </w:tcMar>
+          </w:tcPr>
+          <w:p>
+            <w:r>
+              <w:rPr>
+                <w:rFonts w:ascii="Arial" w:cs="Arial" w:eastAsia="Arial" w:hAnsi="Arial"/>
+                <w:sz w:val="20"/>
+                <w:szCs w:val="20"/>
+              </w:rPr>
+              <w:t xml:space="preserve">Only sellers with a Wema-verified account and CAC registration are listed; deliveries are confirmed by buyers; loan money goes to the seller's verified account.</w:t>
+            </w:r>
+          </w:p>
+        </w:tc>
+      </w:tr>
+      <w:tr>
+        <w:trPr>
+          <w:cantSplit/>
+          <w:tblHeader w:val="false"/>
+        </w:trPr>
+        <w:tc>
+          <w:tcPr>
+            <w:tcW w:type="dxa" w:w="3000"/>
+            <w:tcBorders>
+              <w:top w:val="single" w:color="C9D3E6" w:sz="4"/>
+              <w:left w:val="single" w:color="C9D3E6" w:sz="4"/>
+              <w:bottom w:val="single" w:color="C9D3E6" w:sz="4"/>
+              <w:right w:val="single" w:color="C9D3E6" w:sz="4"/>
+            </w:tcBorders>
+            <w:shd w:fill="FFFFFF" w:color="auto" w:val="clear"/>
+            <w:tcMar>
+              <w:top w:type="dxa" w:w="80"/>
+              <w:left w:type="dxa" w:w="110"/>
+              <w:bottom w:type="dxa" w:w="80"/>
+              <w:right w:type="dxa" w:w="110"/>
+            </w:tcMar>
+          </w:tcPr>
+          <w:p>
+            <w:r>
+              <w:rPr>
+                <w:rFonts w:ascii="Arial" w:cs="Arial" w:eastAsia="Arial" w:hAnsi="Arial"/>
+                <w:sz w:val="20"/>
+                <w:szCs w:val="20"/>
+              </w:rPr>
+              <w:t xml:space="preserve">Traders see CAC as a burden</w:t>
+            </w:r>
+          </w:p>
+        </w:tc>
+        <w:tc>
+          <w:tcPr>
+            <w:tcW w:type="dxa" w:w="6026"/>
+            <w:tcBorders>
+              <w:top w:val="single" w:color="C9D3E6" w:sz="4"/>
+              <w:left w:val="single" w:color="C9D3E6" w:sz="4"/>
+              <w:bottom w:val="single" w:color="C9D3E6" w:sz="4"/>
+              <w:right w:val="single" w:color="C9D3E6" w:sz="4"/>
+            </w:tcBorders>
+            <w:shd w:fill="FFFFFF" w:color="auto" w:val="clear"/>
+            <w:tcMar>
+              <w:top w:type="dxa" w:w="80"/>
+              <w:left w:type="dxa" w:w="110"/>
+              <w:bottom w:type="dxa" w:w="80"/>
+              <w:right w:type="dxa" w:w="110"/>
+            </w:tcMar>
+          </w:tcPr>
+          <w:p>
+            <w:r>
+              <w:rPr>
+                <w:rFonts w:ascii="Arial" w:cs="Arial" w:eastAsia="Arial" w:hAnsi="Arial"/>
+                <w:sz w:val="20"/>
+                <w:szCs w:val="20"/>
+              </w:rPr>
+              <w:t xml:space="preserve">Plain-language explanation of the benefits, small daily savings instead of a lump sum, and Wema handles the filing.</w:t>
+            </w:r>
+          </w:p>
+        </w:tc>
+      </w:tr>
     </w:tbl>
     <w:p>
       <w:pPr>
@@ -5925,7 +8725,7 @@
           <w:sz w:val="30"/>
           <w:szCs w:val="30"/>
         </w:rPr>
-        <w:t xml:space="preserve">11. Why Vendora fits Hackaholics 7.0</w:t>
+        <w:t xml:space="preserve">12. Why Vendora fits Hackaholics 7.0</w:t>
       </w:r>
     </w:p>
     <w:p>
@@ -6033,6 +8833,24 @@
           <w:sz w:val="22"/>
           <w:szCs w:val="22"/>
         </w:rPr>
+        <w:t xml:space="preserve">It is already built: a working MVP judges can open today, with records designed to be trusted by a bank.</w:t>
+      </w:r>
+    </w:p>
+    <w:p>
+      <w:pPr>
+        <w:pStyle w:val="ListParagraph"/>
+        <w:numPr>
+          <w:ilvl w:val="0"/>
+          <w:numId w:val="3"/>
+        </w:numPr>
+        <w:spacing w:after="80" w:line="290"/>
+      </w:pPr>
+      <w:r>
+        <w:rPr>
+          <w:rFonts w:ascii="Arial" w:cs="Arial" w:eastAsia="Arial" w:hAnsi="Arial"/>
+          <w:sz w:val="22"/>
+          <w:szCs w:val="22"/>
+        </w:rPr>
         <w:t xml:space="preserve">It is led by a woman, building for markets where many traders are women.</w:t>
       </w:r>
     </w:p>
@@ -6053,7 +8871,7 @@
           <w:sz w:val="30"/>
           <w:szCs w:val="30"/>
         </w:rPr>
-        <w:t xml:space="preserve">12. Conclusion</w:t>
+        <w:t xml:space="preserve">13. Conclusion</w:t>
       </w:r>
     </w:p>
     <w:p>
@@ -6066,7 +8884,7 @@
           <w:sz w:val="22"/>
           <w:szCs w:val="22"/>
         </w:rPr>
-        <w:t xml:space="preserve">Market traders do not need more complicated software. They need technology that works the way they already do: by talking. Vendora turns a trader's voice into accurate records, protected payments and, for the first time, a path to bank loans. Built with Wema Bank, Vendora can bring thousands of traders into formal banking, one conversation at a time.</w:t>
+        <w:t xml:space="preserve">Market traders do not need more complicated software. They need technology that works the way they already do: by talking. Vendora turns a trader's voice into accurate records, protected payments, trusted suppliers, a registered business and, for the first time, a path to bank loans. Built with Wema Bank, Vendora can bring thousands of traders into formal banking, one conversation at a time.</w:t>
       </w:r>
     </w:p>
     <w:sectPr>
@@ -6334,6 +9152,18 @@
       </w:pPr>
     </w:lvl>
   </w:abstractNum>
+  <w:abstractNum w:abstractNumId="6" w15:restartNumberingAfterBreak="0">
+    <w:multiLevelType w:val="hybridMultilevel"/>
+    <w:lvl w:ilvl="0" w15:tentative="1">
+      <w:start w:val="1"/>
+      <w:numFmt w:val="decimal"/>
+      <w:lvlText w:val="%1."/>
+      <w:lvlJc w:val="left"/>
+      <w:pPr>
+        <w:ind w:left="540" w:hanging="300"/>
+      </w:pPr>
+    </w:lvl>
+  </w:abstractNum>
   <w:num w:numId="1">
     <w:abstractNumId w:val="1"/>
     <w:lvlOverride w:ilvl="0">
@@ -6353,6 +9183,12 @@
     </w:lvlOverride>
   </w:num>
   <w:num w:numId="4">
+    <w:abstractNumId w:val="6"/>
+    <w:lvlOverride w:ilvl="0">
+      <w:startOverride w:val="1"/>
+    </w:lvlOverride>
+  </w:num>
+  <w:num w:numId="5">
     <w:abstractNumId w:val="5"/>
     <w:lvlOverride w:ilvl="0">
       <w:startOverride w:val="1"/>

</xml_diff>

<commit_message>
Live link is now https://vendora-app.onrender.com
Co-Authored-By: Claude Opus 5.5 <noreply@anthropic.com>
Claude-Session: https://claude.ai/code/session_01RWS1ehYaye8ci8hcvFBjhP
</commit_message>
<xml_diff>
--- a/docs/Vendora_Concept_Note_Wema_Hackaholics_7.docx
+++ b/docs/Vendora_Concept_Note_Wema_Hackaholics_7.docx
@@ -475,7 +475,7 @@
                 <w:sz w:val="20"/>
                 <w:szCs w:val="20"/>
               </w:rPr>
-              <w:t xml:space="preserve">https://devemmy.github.io/VENDORA/ (open in Chrome; tap "Explore a sample shop")</w:t>
+              <w:t xml:space="preserve">https://vendora-app.onrender.com/ (open in Chrome; tap "Explore a sample shop")</w:t>
             </w:r>
           </w:p>
         </w:tc>
@@ -882,7 +882,7 @@
                 <w:sz w:val="22"/>
                 <w:szCs w:val="22"/>
               </w:rPr>
-              <w:t xml:space="preserve">https://devemmy.github.io/VENDORA/</w:t>
+              <w:t xml:space="preserve">https://vendora-app.onrender.com/</w:t>
             </w:r>
             <w:r>
               <w:rPr>
@@ -5593,7 +5593,7 @@
                 <w:sz w:val="20"/>
                 <w:szCs w:val="20"/>
               </w:rPr>
-              <w:t xml:space="preserve">Live at https://devemmy.github.io/VENDORA/. Installs to the home screen and works offline.</w:t>
+              <w:t xml:space="preserve">Live at https://vendora-app.onrender.com/. Installs to the home screen and works offline.</w:t>
             </w:r>
           </w:p>
         </w:tc>

</xml_diff>